<commit_message>
Son sürüm: Kodlar ve rapor yüklendi (Güvenlik güncellemeleriyle)
</commit_message>
<xml_diff>
--- a/Proje2_Rapor_Taslagi.docx
+++ b/Proje2_Rapor_Taslagi.docx
@@ -48,10 +48,12 @@
     <w:p>
       <w:pPr>
         <w:pStyle w:val="NormalWeb"/>
-        <w:rPr>
-          <w:b/>
-          <w:bCs/>
-          <w:color w:val="000000"/>
+        <w:ind w:left="1440" w:firstLine="720"/>
+        <w:rPr>
+          <w:b/>
+          <w:bCs/>
+          <w:color w:val="000000"/>
+          <w:lang w:val="en-US"/>
         </w:rPr>
       </w:pPr>
       <w:r>
@@ -86,21 +88,22 @@
         </w:rPr>
         <w:t>2</w:t>
       </w:r>
-      <w:r>
+    </w:p>
+    <w:p>
+      <w:pPr>
+        <w:pStyle w:val="NormalWeb"/>
         <w:rPr>
           <w:b/>
           <w:bCs/>
           <w:color w:val="000000"/>
           <w:lang w:val="en-US"/>
         </w:rPr>
-        <w:t xml:space="preserve">: </w:t>
-      </w:r>
-      <w:r>
-        <w:rPr>
-          <w:b/>
-          <w:bCs/>
-          <w:color w:val="000000"/>
-          <w:lang w:val="en-US"/>
+      </w:pPr>
+      <w:r>
+        <w:rPr>
+          <w:b/>
+          <w:bCs/>
+          <w:color w:val="000000"/>
         </w:rPr>
         <w:t>GERÇEK</w:t>
       </w:r>
@@ -109,7 +112,6 @@
           <w:b/>
           <w:bCs/>
           <w:color w:val="000000"/>
-          <w:lang w:val="en-US"/>
         </w:rPr>
         <w:t xml:space="preserve"> </w:t>
       </w:r>
@@ -118,16 +120,14 @@
           <w:b/>
           <w:bCs/>
           <w:color w:val="000000"/>
-          <w:lang w:val="en-US"/>
-        </w:rPr>
-        <w:t>ZAMANLI VERİ</w:t>
-      </w:r>
-      <w:r>
-        <w:rPr>
-          <w:b/>
-          <w:bCs/>
-          <w:color w:val="000000"/>
-          <w:lang w:val="en-US"/>
+        </w:rPr>
+        <w:t>ZAMANLI</w:t>
+      </w:r>
+      <w:r>
+        <w:rPr>
+          <w:b/>
+          <w:bCs/>
+          <w:color w:val="000000"/>
         </w:rPr>
         <w:t xml:space="preserve"> </w:t>
       </w:r>
@@ -136,7 +136,22 @@
           <w:b/>
           <w:bCs/>
           <w:color w:val="000000"/>
-          <w:lang w:val="en-US"/>
+        </w:rPr>
+        <w:t>VERİ</w:t>
+      </w:r>
+      <w:r>
+        <w:rPr>
+          <w:b/>
+          <w:bCs/>
+          <w:color w:val="000000"/>
+        </w:rPr>
+        <w:t xml:space="preserve"> </w:t>
+      </w:r>
+      <w:r>
+        <w:rPr>
+          <w:b/>
+          <w:bCs/>
+          <w:color w:val="000000"/>
         </w:rPr>
         <w:t>AKIŞI</w:t>
       </w:r>
@@ -145,7 +160,6 @@
           <w:b/>
           <w:bCs/>
           <w:color w:val="000000"/>
-          <w:lang w:val="en-US"/>
         </w:rPr>
         <w:t xml:space="preserve"> </w:t>
       </w:r>
@@ -154,7 +168,6 @@
           <w:b/>
           <w:bCs/>
           <w:color w:val="000000"/>
-          <w:lang w:val="en-US"/>
         </w:rPr>
         <w:t>VE</w:t>
       </w:r>
@@ -163,7 +176,6 @@
           <w:b/>
           <w:bCs/>
           <w:color w:val="000000"/>
-          <w:lang w:val="en-US"/>
         </w:rPr>
         <w:t xml:space="preserve"> </w:t>
       </w:r>
@@ -172,9 +184,72 @@
           <w:b/>
           <w:bCs/>
           <w:color w:val="000000"/>
-          <w:lang w:val="en-US"/>
         </w:rPr>
         <w:t>İŞLEME</w:t>
+      </w:r>
+      <w:r>
+        <w:rPr>
+          <w:b/>
+          <w:bCs/>
+          <w:color w:val="000000"/>
+        </w:rPr>
+        <w:t xml:space="preserve"> (</w:t>
+      </w:r>
+      <w:r>
+        <w:rPr>
+          <w:b/>
+          <w:bCs/>
+          <w:color w:val="000000"/>
+        </w:rPr>
+        <w:t>ARAÇ</w:t>
+      </w:r>
+      <w:r>
+        <w:rPr>
+          <w:b/>
+          <w:bCs/>
+          <w:color w:val="000000"/>
+        </w:rPr>
+        <w:t xml:space="preserve"> </w:t>
+      </w:r>
+      <w:r>
+        <w:rPr>
+          <w:b/>
+          <w:bCs/>
+          <w:color w:val="000000"/>
+        </w:rPr>
+        <w:t>TELEMETRİSİ</w:t>
+      </w:r>
+      <w:r>
+        <w:rPr>
+          <w:b/>
+          <w:bCs/>
+          <w:color w:val="000000"/>
+        </w:rPr>
+        <w:t xml:space="preserve"> IoT </w:t>
+      </w:r>
+      <w:r>
+        <w:rPr>
+          <w:b/>
+          <w:bCs/>
+          <w:color w:val="000000"/>
+        </w:rPr>
+        <w:t>UYGULAMASI</w:t>
+      </w:r>
+      <w:r>
+        <w:rPr>
+          <w:b/>
+          <w:bCs/>
+          <w:color w:val="000000"/>
+        </w:rPr>
+        <w:t>)</w:t>
+      </w:r>
+      <w:r>
+        <w:rPr>
+          <w:b/>
+          <w:bCs/>
+          <w:color w:val="000000"/>
+        </w:rPr>
+        <w:t xml:space="preserve">     </w:t>
       </w:r>
     </w:p>
     <w:p>
@@ -191,7 +266,15 @@
           <w:bCs/>
           <w:color w:val="000000"/>
         </w:rPr>
-        <w:t xml:space="preserve">     PROJE RAPORU</w:t>
+        <w:t xml:space="preserve">        </w:t>
+      </w:r>
+      <w:r>
+        <w:rPr>
+          <w:b/>
+          <w:bCs/>
+          <w:color w:val="000000"/>
+        </w:rPr>
+        <w:t>PROJE RAPORU</w:t>
       </w:r>
     </w:p>
     <w:p>
@@ -303,7 +386,7 @@
         </w:rPr>
         <w:t xml:space="preserve"> </w:t>
       </w:r>
-      <w:hyperlink r:id="rId4" w:history="1"/>
+      <w:hyperlink r:id="rId7" w:history="1"/>
     </w:p>
     <w:p>
       <w:pPr>
@@ -400,7 +483,7 @@
                     <pic:cNvPicPr/>
                   </pic:nvPicPr>
                   <pic:blipFill>
-                    <a:blip r:embed="rId5">
+                    <a:blip r:embed="rId8">
                       <a:extLst>
                         <a:ext uri="{28A0092B-C50C-407E-A947-70E740481C1C}">
                           <a14:useLocalDpi xmlns:a14="http://schemas.microsoft.com/office/drawing/2010/main" val="0"/>
@@ -428,6 +511,1340 @@
       </w:r>
     </w:p>
     <w:p/>
+    <w:p>
+      <w:pPr>
+        <w:spacing w:before="100" w:beforeAutospacing="1" w:after="100" w:afterAutospacing="1" w:line="240" w:lineRule="auto"/>
+        <w:outlineLvl w:val="2"/>
+        <w:rPr>
+          <w:rFonts w:ascii="Times New Roman" w:eastAsia="Times New Roman" w:hAnsi="Times New Roman" w:cs="Times New Roman"/>
+          <w:b/>
+          <w:bCs/>
+          <w:color w:val="000000"/>
+          <w:kern w:val="0"/>
+          <w:sz w:val="27"/>
+          <w:szCs w:val="27"/>
+          <w14:ligatures w14:val="none"/>
+        </w:rPr>
+      </w:pPr>
+    </w:p>
+    <w:p>
+      <w:pPr>
+        <w:spacing w:before="100" w:beforeAutospacing="1" w:after="100" w:afterAutospacing="1" w:line="240" w:lineRule="auto"/>
+        <w:outlineLvl w:val="2"/>
+        <w:rPr>
+          <w:rFonts w:ascii="Times New Roman" w:eastAsia="Times New Roman" w:hAnsi="Times New Roman" w:cs="Times New Roman"/>
+          <w:b/>
+          <w:bCs/>
+          <w:color w:val="000000"/>
+          <w:kern w:val="0"/>
+          <w:sz w:val="27"/>
+          <w:szCs w:val="27"/>
+          <w14:ligatures w14:val="none"/>
+        </w:rPr>
+      </w:pPr>
+    </w:p>
+    <w:p>
+      <w:pPr>
+        <w:spacing w:before="100" w:beforeAutospacing="1" w:after="100" w:afterAutospacing="1" w:line="240" w:lineRule="auto"/>
+        <w:outlineLvl w:val="2"/>
+        <w:rPr>
+          <w:rFonts w:ascii="Times New Roman" w:eastAsia="Times New Roman" w:hAnsi="Times New Roman" w:cs="Times New Roman"/>
+          <w:b/>
+          <w:bCs/>
+          <w:color w:val="000000"/>
+          <w:kern w:val="0"/>
+          <w:sz w:val="27"/>
+          <w:szCs w:val="27"/>
+          <w14:ligatures w14:val="none"/>
+        </w:rPr>
+      </w:pPr>
+    </w:p>
+    <w:p>
+      <w:pPr>
+        <w:spacing w:before="100" w:beforeAutospacing="1" w:after="100" w:afterAutospacing="1" w:line="240" w:lineRule="auto"/>
+        <w:outlineLvl w:val="2"/>
+        <w:rPr>
+          <w:rFonts w:ascii="Times New Roman" w:eastAsia="Times New Roman" w:hAnsi="Times New Roman" w:cs="Times New Roman"/>
+          <w:b/>
+          <w:bCs/>
+          <w:color w:val="000000"/>
+          <w:kern w:val="0"/>
+          <w:sz w:val="27"/>
+          <w:szCs w:val="27"/>
+          <w14:ligatures w14:val="none"/>
+        </w:rPr>
+      </w:pPr>
+    </w:p>
+    <w:p>
+      <w:pPr>
+        <w:spacing w:before="100" w:beforeAutospacing="1" w:after="100" w:afterAutospacing="1" w:line="240" w:lineRule="auto"/>
+        <w:outlineLvl w:val="2"/>
+        <w:rPr>
+          <w:rFonts w:ascii="Times New Roman" w:eastAsia="Times New Roman" w:hAnsi="Times New Roman" w:cs="Times New Roman"/>
+          <w:b/>
+          <w:bCs/>
+          <w:color w:val="000000"/>
+          <w:kern w:val="0"/>
+          <w:sz w:val="27"/>
+          <w:szCs w:val="27"/>
+          <w14:ligatures w14:val="none"/>
+        </w:rPr>
+      </w:pPr>
+      <w:r>
+        <w:rPr>
+          <w:rFonts w:ascii="Times New Roman" w:eastAsia="Times New Roman" w:hAnsi="Times New Roman" w:cs="Times New Roman"/>
+          <w:b/>
+          <w:bCs/>
+          <w:color w:val="000000"/>
+          <w:kern w:val="0"/>
+          <w:sz w:val="27"/>
+          <w:szCs w:val="27"/>
+          <w14:ligatures w14:val="none"/>
+        </w:rPr>
+        <w:t>1. GİRİŞ VE PROJE AMACI</w:t>
+      </w:r>
+    </w:p>
+    <w:p>
+      <w:pPr>
+        <w:spacing w:before="100" w:beforeAutospacing="1" w:after="100" w:afterAutospacing="1" w:line="240" w:lineRule="auto"/>
+        <w:outlineLvl w:val="2"/>
+        <w:rPr>
+          <w:rFonts w:ascii="Times New Roman" w:eastAsia="Times New Roman" w:hAnsi="Times New Roman" w:cs="Times New Roman"/>
+          <w:color w:val="000000"/>
+          <w:kern w:val="0"/>
+          <w14:ligatures w14:val="none"/>
+        </w:rPr>
+      </w:pPr>
+      <w:r>
+        <w:rPr>
+          <w:rFonts w:ascii="Times New Roman" w:eastAsia="Times New Roman" w:hAnsi="Times New Roman" w:cs="Times New Roman"/>
+          <w:color w:val="000000"/>
+          <w:kern w:val="0"/>
+          <w14:ligatures w14:val="none"/>
+        </w:rPr>
+        <w:t>Bu proje kapsamında, bir aracın telemetri verilerinin (hız, motor devri, GPS) gerçek zamanlı olarak simüle edilmesi, bulut sunucusu (EC2) üzerinden WebSocket protokolüyle yayınlanması ve NoSQL veritabanında (DynamoDB) depolanması hedeflenmiştir. Uygulama, fiziksel bir IoT cihazının bulut ekosistemiyle nasıl entegre olduğunu uçtan uca simüle etmektedir.</w:t>
+      </w:r>
+    </w:p>
+    <w:p>
+      <w:pPr>
+        <w:spacing w:before="100" w:beforeAutospacing="1" w:after="100" w:afterAutospacing="1" w:line="240" w:lineRule="auto"/>
+        <w:outlineLvl w:val="2"/>
+        <w:rPr>
+          <w:rFonts w:ascii="Times New Roman" w:eastAsia="Times New Roman" w:hAnsi="Times New Roman" w:cs="Times New Roman"/>
+          <w:b/>
+          <w:bCs/>
+          <w:color w:val="000000"/>
+          <w:kern w:val="0"/>
+          <w:sz w:val="27"/>
+          <w:szCs w:val="27"/>
+          <w14:ligatures w14:val="none"/>
+        </w:rPr>
+      </w:pPr>
+      <w:r>
+        <w:rPr>
+          <w:rFonts w:ascii="Times New Roman" w:eastAsia="Times New Roman" w:hAnsi="Times New Roman" w:cs="Times New Roman"/>
+          <w:b/>
+          <w:bCs/>
+          <w:color w:val="000000"/>
+          <w:kern w:val="0"/>
+          <w:sz w:val="27"/>
+          <w:szCs w:val="27"/>
+          <w14:ligatures w14:val="none"/>
+        </w:rPr>
+        <w:t>2. KULLANILAN TEKNOLOJİLER</w:t>
+      </w:r>
+    </w:p>
+    <w:p>
+      <w:pPr>
+        <w:pStyle w:val="NormalWeb"/>
+        <w:rPr>
+          <w:color w:val="000000"/>
+        </w:rPr>
+      </w:pPr>
+      <w:r>
+        <w:rPr>
+          <w:color w:val="000000"/>
+        </w:rPr>
+        <w:t>Proje, yüksek erişilebilirlik ve süreklilik için tamamen bulut ortamına taşınmıştır:</w:t>
+      </w:r>
+    </w:p>
+    <w:p>
+      <w:pPr>
+        <w:pStyle w:val="NormalWeb"/>
+        <w:numPr>
+          <w:ilvl w:val="0"/>
+          <w:numId w:val="3"/>
+        </w:numPr>
+        <w:rPr>
+          <w:color w:val="000000"/>
+        </w:rPr>
+      </w:pPr>
+      <w:r>
+        <w:rPr>
+          <w:b/>
+          <w:bCs/>
+          <w:color w:val="000000"/>
+        </w:rPr>
+        <w:t>Sunucu Katmanı:</w:t>
+      </w:r>
+      <w:r>
+        <w:rPr>
+          <w:rStyle w:val="apple-converted-space"/>
+          <w:color w:val="000000"/>
+        </w:rPr>
+        <w:t> </w:t>
+      </w:r>
+      <w:r>
+        <w:rPr>
+          <w:color w:val="000000"/>
+        </w:rPr>
+        <w:t>AWS EC2 (Ubuntu 22.04 LTS) - Stockholm Bölgesi.</w:t>
+      </w:r>
+    </w:p>
+    <w:p>
+      <w:pPr>
+        <w:pStyle w:val="NormalWeb"/>
+        <w:numPr>
+          <w:ilvl w:val="0"/>
+          <w:numId w:val="3"/>
+        </w:numPr>
+        <w:rPr>
+          <w:color w:val="000000"/>
+        </w:rPr>
+      </w:pPr>
+      <w:r>
+        <w:rPr>
+          <w:b/>
+          <w:bCs/>
+          <w:color w:val="000000"/>
+        </w:rPr>
+        <w:t>Veritabanı Katmanı:</w:t>
+      </w:r>
+      <w:r>
+        <w:rPr>
+          <w:rStyle w:val="apple-converted-space"/>
+          <w:color w:val="000000"/>
+        </w:rPr>
+        <w:t> </w:t>
+      </w:r>
+      <w:r>
+        <w:rPr>
+          <w:color w:val="000000"/>
+        </w:rPr>
+        <w:t>AWS DynamoDB (Ohio Bölgesi).</w:t>
+      </w:r>
+    </w:p>
+    <w:p>
+      <w:pPr>
+        <w:pStyle w:val="NormalWeb"/>
+        <w:numPr>
+          <w:ilvl w:val="0"/>
+          <w:numId w:val="3"/>
+        </w:numPr>
+        <w:rPr>
+          <w:color w:val="000000"/>
+        </w:rPr>
+      </w:pPr>
+      <w:r>
+        <w:rPr>
+          <w:b/>
+          <w:bCs/>
+          <w:color w:val="000000"/>
+        </w:rPr>
+        <w:t>Haberleşme:</w:t>
+      </w:r>
+      <w:r>
+        <w:rPr>
+          <w:rStyle w:val="apple-converted-space"/>
+          <w:color w:val="000000"/>
+        </w:rPr>
+        <w:t> </w:t>
+      </w:r>
+      <w:r>
+        <w:rPr>
+          <w:color w:val="000000"/>
+        </w:rPr>
+        <w:t>WebSocket (8081 Portu).</w:t>
+      </w:r>
+    </w:p>
+    <w:p>
+      <w:pPr>
+        <w:pStyle w:val="NormalWeb"/>
+        <w:numPr>
+          <w:ilvl w:val="0"/>
+          <w:numId w:val="3"/>
+        </w:numPr>
+        <w:rPr>
+          <w:color w:val="000000"/>
+        </w:rPr>
+      </w:pPr>
+      <w:r>
+        <w:rPr>
+          <w:b/>
+          <w:bCs/>
+          <w:color w:val="000000"/>
+        </w:rPr>
+        <w:t>Süreç Yönetimi:</w:t>
+      </w:r>
+      <w:r>
+        <w:rPr>
+          <w:rStyle w:val="apple-converted-space"/>
+          <w:color w:val="000000"/>
+        </w:rPr>
+        <w:t> </w:t>
+      </w:r>
+      <w:r>
+        <w:rPr>
+          <w:color w:val="000000"/>
+        </w:rPr>
+        <w:t>PM2 (Projenin 7/24 kesintisiz çalışması için).</w:t>
+      </w:r>
+    </w:p>
+    <w:p>
+      <w:pPr>
+        <w:pStyle w:val="NormalWeb"/>
+        <w:numPr>
+          <w:ilvl w:val="0"/>
+          <w:numId w:val="3"/>
+        </w:numPr>
+        <w:rPr>
+          <w:color w:val="000000"/>
+        </w:rPr>
+      </w:pPr>
+      <w:r>
+        <w:rPr>
+          <w:b/>
+          <w:bCs/>
+          <w:color w:val="000000"/>
+        </w:rPr>
+        <w:t>Simülasyon Nesnesi:</w:t>
+      </w:r>
+      <w:r>
+        <w:rPr>
+          <w:rStyle w:val="apple-converted-space"/>
+          <w:color w:val="000000"/>
+        </w:rPr>
+        <w:t> </w:t>
+      </w:r>
+      <w:r>
+        <w:rPr>
+          <w:color w:val="000000"/>
+        </w:rPr>
+        <w:t>Hyundai Accent Blue 1.4 Telemetri Verileri.</w:t>
+      </w:r>
+    </w:p>
+    <w:p>
+      <w:pPr>
+        <w:spacing w:before="100" w:beforeAutospacing="1" w:after="100" w:afterAutospacing="1" w:line="240" w:lineRule="auto"/>
+        <w:outlineLvl w:val="2"/>
+        <w:rPr>
+          <w:rFonts w:ascii="Times New Roman" w:eastAsia="Times New Roman" w:hAnsi="Times New Roman" w:cs="Times New Roman"/>
+          <w:b/>
+          <w:bCs/>
+          <w:color w:val="000000"/>
+          <w:kern w:val="0"/>
+          <w:sz w:val="27"/>
+          <w:szCs w:val="27"/>
+          <w14:ligatures w14:val="none"/>
+        </w:rPr>
+      </w:pPr>
+    </w:p>
+    <w:p>
+      <w:pPr>
+        <w:spacing w:before="100" w:beforeAutospacing="1" w:after="100" w:afterAutospacing="1" w:line="240" w:lineRule="auto"/>
+        <w:outlineLvl w:val="2"/>
+        <w:rPr>
+          <w:rFonts w:ascii="Times New Roman" w:eastAsia="Times New Roman" w:hAnsi="Times New Roman" w:cs="Times New Roman"/>
+          <w:b/>
+          <w:bCs/>
+          <w:color w:val="000000"/>
+          <w:kern w:val="0"/>
+          <w:sz w:val="27"/>
+          <w:szCs w:val="27"/>
+          <w14:ligatures w14:val="none"/>
+        </w:rPr>
+      </w:pPr>
+    </w:p>
+    <w:p>
+      <w:pPr>
+        <w:spacing w:before="100" w:beforeAutospacing="1" w:after="100" w:afterAutospacing="1" w:line="240" w:lineRule="auto"/>
+        <w:outlineLvl w:val="2"/>
+        <w:rPr>
+          <w:rFonts w:ascii="Times New Roman" w:eastAsia="Times New Roman" w:hAnsi="Times New Roman" w:cs="Times New Roman"/>
+          <w:b/>
+          <w:bCs/>
+          <w:color w:val="000000"/>
+          <w:kern w:val="0"/>
+          <w:sz w:val="27"/>
+          <w:szCs w:val="27"/>
+          <w14:ligatures w14:val="none"/>
+        </w:rPr>
+      </w:pPr>
+    </w:p>
+    <w:p>
+      <w:pPr>
+        <w:spacing w:before="100" w:beforeAutospacing="1" w:after="100" w:afterAutospacing="1" w:line="240" w:lineRule="auto"/>
+        <w:outlineLvl w:val="2"/>
+        <w:rPr>
+          <w:rFonts w:ascii="Times New Roman" w:eastAsia="Times New Roman" w:hAnsi="Times New Roman" w:cs="Times New Roman"/>
+          <w:b/>
+          <w:bCs/>
+          <w:color w:val="000000"/>
+          <w:kern w:val="0"/>
+          <w:sz w:val="27"/>
+          <w:szCs w:val="27"/>
+          <w14:ligatures w14:val="none"/>
+        </w:rPr>
+      </w:pPr>
+    </w:p>
+    <w:p>
+      <w:pPr>
+        <w:spacing w:before="100" w:beforeAutospacing="1" w:after="100" w:afterAutospacing="1" w:line="240" w:lineRule="auto"/>
+        <w:outlineLvl w:val="2"/>
+        <w:rPr>
+          <w:rFonts w:ascii="Times New Roman" w:eastAsia="Times New Roman" w:hAnsi="Times New Roman" w:cs="Times New Roman"/>
+          <w:b/>
+          <w:bCs/>
+          <w:color w:val="000000"/>
+          <w:kern w:val="0"/>
+          <w:sz w:val="27"/>
+          <w:szCs w:val="27"/>
+          <w14:ligatures w14:val="none"/>
+        </w:rPr>
+      </w:pPr>
+    </w:p>
+    <w:p>
+      <w:pPr>
+        <w:spacing w:before="100" w:beforeAutospacing="1" w:after="100" w:afterAutospacing="1" w:line="240" w:lineRule="auto"/>
+        <w:outlineLvl w:val="2"/>
+        <w:rPr>
+          <w:rFonts w:ascii="Times New Roman" w:eastAsia="Times New Roman" w:hAnsi="Times New Roman" w:cs="Times New Roman"/>
+          <w:b/>
+          <w:bCs/>
+          <w:color w:val="000000"/>
+          <w:kern w:val="0"/>
+          <w:sz w:val="27"/>
+          <w:szCs w:val="27"/>
+          <w14:ligatures w14:val="none"/>
+        </w:rPr>
+      </w:pPr>
+    </w:p>
+    <w:p>
+      <w:pPr>
+        <w:spacing w:before="100" w:beforeAutospacing="1" w:after="100" w:afterAutospacing="1" w:line="240" w:lineRule="auto"/>
+        <w:outlineLvl w:val="2"/>
+        <w:rPr>
+          <w:rFonts w:ascii="Times New Roman" w:eastAsia="Times New Roman" w:hAnsi="Times New Roman" w:cs="Times New Roman"/>
+          <w:b/>
+          <w:bCs/>
+          <w:color w:val="000000"/>
+          <w:kern w:val="0"/>
+          <w:sz w:val="27"/>
+          <w:szCs w:val="27"/>
+          <w14:ligatures w14:val="none"/>
+        </w:rPr>
+      </w:pPr>
+    </w:p>
+    <w:p>
+      <w:pPr>
+        <w:spacing w:before="100" w:beforeAutospacing="1" w:after="100" w:afterAutospacing="1" w:line="240" w:lineRule="auto"/>
+        <w:outlineLvl w:val="2"/>
+        <w:rPr>
+          <w:rFonts w:ascii="Times New Roman" w:eastAsia="Times New Roman" w:hAnsi="Times New Roman" w:cs="Times New Roman"/>
+          <w:b/>
+          <w:bCs/>
+          <w:color w:val="000000"/>
+          <w:kern w:val="0"/>
+          <w:sz w:val="27"/>
+          <w:szCs w:val="27"/>
+          <w14:ligatures w14:val="none"/>
+        </w:rPr>
+      </w:pPr>
+    </w:p>
+    <w:p>
+      <w:pPr>
+        <w:spacing w:before="100" w:beforeAutospacing="1" w:after="100" w:afterAutospacing="1" w:line="240" w:lineRule="auto"/>
+        <w:outlineLvl w:val="2"/>
+        <w:rPr>
+          <w:rFonts w:ascii="Times New Roman" w:eastAsia="Times New Roman" w:hAnsi="Times New Roman" w:cs="Times New Roman"/>
+          <w:b/>
+          <w:bCs/>
+          <w:color w:val="000000"/>
+          <w:kern w:val="0"/>
+          <w:sz w:val="27"/>
+          <w:szCs w:val="27"/>
+          <w14:ligatures w14:val="none"/>
+        </w:rPr>
+      </w:pPr>
+    </w:p>
+    <w:p>
+      <w:pPr>
+        <w:spacing w:before="100" w:beforeAutospacing="1" w:after="100" w:afterAutospacing="1" w:line="240" w:lineRule="auto"/>
+        <w:outlineLvl w:val="2"/>
+        <w:rPr>
+          <w:rFonts w:ascii="Times New Roman" w:eastAsia="Times New Roman" w:hAnsi="Times New Roman" w:cs="Times New Roman"/>
+          <w:b/>
+          <w:bCs/>
+          <w:color w:val="000000"/>
+          <w:kern w:val="0"/>
+          <w:sz w:val="27"/>
+          <w:szCs w:val="27"/>
+          <w14:ligatures w14:val="none"/>
+        </w:rPr>
+      </w:pPr>
+    </w:p>
+    <w:p>
+      <w:pPr>
+        <w:spacing w:before="100" w:beforeAutospacing="1" w:after="100" w:afterAutospacing="1" w:line="240" w:lineRule="auto"/>
+        <w:outlineLvl w:val="2"/>
+        <w:rPr>
+          <w:rFonts w:ascii="Times New Roman" w:eastAsia="Times New Roman" w:hAnsi="Times New Roman" w:cs="Times New Roman"/>
+          <w:b/>
+          <w:bCs/>
+          <w:color w:val="000000"/>
+          <w:kern w:val="0"/>
+          <w:sz w:val="27"/>
+          <w:szCs w:val="27"/>
+          <w14:ligatures w14:val="none"/>
+        </w:rPr>
+      </w:pPr>
+    </w:p>
+    <w:p>
+      <w:pPr>
+        <w:spacing w:before="100" w:beforeAutospacing="1" w:after="100" w:afterAutospacing="1" w:line="240" w:lineRule="auto"/>
+        <w:outlineLvl w:val="2"/>
+        <w:rPr>
+          <w:rFonts w:ascii="Times New Roman" w:eastAsia="Times New Roman" w:hAnsi="Times New Roman" w:cs="Times New Roman"/>
+          <w:b/>
+          <w:bCs/>
+          <w:color w:val="000000"/>
+          <w:kern w:val="0"/>
+          <w:sz w:val="27"/>
+          <w:szCs w:val="27"/>
+          <w14:ligatures w14:val="none"/>
+        </w:rPr>
+      </w:pPr>
+      <w:r>
+        <w:rPr>
+          <w:rFonts w:ascii="Times New Roman" w:eastAsia="Times New Roman" w:hAnsi="Times New Roman" w:cs="Times New Roman"/>
+          <w:b/>
+          <w:bCs/>
+          <w:color w:val="000000"/>
+          <w:kern w:val="0"/>
+          <w:sz w:val="27"/>
+          <w:szCs w:val="27"/>
+          <w14:ligatures w14:val="none"/>
+        </w:rPr>
+        <w:t>3. UYGULAMA DETAYLARI VE EKRAN GÖRÜNTÜLERİ</w:t>
+      </w:r>
+    </w:p>
+    <w:p>
+      <w:pPr>
+        <w:spacing w:before="100" w:beforeAutospacing="1" w:after="100" w:afterAutospacing="1" w:line="240" w:lineRule="auto"/>
+        <w:outlineLvl w:val="3"/>
+        <w:rPr>
+          <w:rFonts w:ascii="Times New Roman" w:eastAsia="Times New Roman" w:hAnsi="Times New Roman" w:cs="Times New Roman"/>
+          <w:b/>
+          <w:bCs/>
+          <w:color w:val="000000"/>
+          <w:kern w:val="0"/>
+          <w14:ligatures w14:val="none"/>
+        </w:rPr>
+      </w:pPr>
+      <w:r>
+        <w:rPr>
+          <w:rFonts w:ascii="Times New Roman" w:eastAsia="Times New Roman" w:hAnsi="Times New Roman" w:cs="Times New Roman"/>
+          <w:b/>
+          <w:bCs/>
+          <w:color w:val="000000"/>
+          <w:kern w:val="0"/>
+          <w14:ligatures w14:val="none"/>
+        </w:rPr>
+        <w:t>3.1. Bulut Sunucusu ve Güvenlik Yapılandırması</w:t>
+      </w:r>
+    </w:p>
+    <w:p>
+      <w:pPr>
+        <w:spacing w:before="100" w:beforeAutospacing="1" w:after="100" w:afterAutospacing="1" w:line="240" w:lineRule="auto"/>
+        <w:rPr>
+          <w:rFonts w:ascii="Times New Roman" w:eastAsia="Times New Roman" w:hAnsi="Times New Roman" w:cs="Times New Roman"/>
+          <w:color w:val="000000"/>
+          <w:kern w:val="0"/>
+          <w14:ligatures w14:val="none"/>
+        </w:rPr>
+      </w:pPr>
+      <w:r>
+        <w:rPr>
+          <w:rFonts w:ascii="Times New Roman" w:eastAsia="Times New Roman" w:hAnsi="Times New Roman" w:cs="Times New Roman"/>
+          <w:color w:val="000000"/>
+          <w:kern w:val="0"/>
+          <w14:ligatures w14:val="none"/>
+        </w:rPr>
+        <w:t>Uygulama, </w:t>
+      </w:r>
+      <w:r>
+        <w:rPr>
+          <w:rFonts w:ascii="Courier New" w:eastAsia="Times New Roman" w:hAnsi="Courier New" w:cs="Courier New"/>
+          <w:color w:val="000000"/>
+          <w:kern w:val="0"/>
+          <w:sz w:val="20"/>
+          <w:szCs w:val="20"/>
+          <w14:ligatures w14:val="none"/>
+        </w:rPr>
+        <w:t>13.62.54.131</w:t>
+      </w:r>
+      <w:r>
+        <w:rPr>
+          <w:rFonts w:ascii="Times New Roman" w:eastAsia="Times New Roman" w:hAnsi="Times New Roman" w:cs="Times New Roman"/>
+          <w:color w:val="000000"/>
+          <w:kern w:val="0"/>
+          <w14:ligatures w14:val="none"/>
+        </w:rPr>
+        <w:t> IP adresine sahip EC2 sunucusu üzerinde barındırılmaktadır. Dış dünyadan erişim için Security Group üzerinden </w:t>
+      </w:r>
+      <w:r>
+        <w:rPr>
+          <w:rFonts w:ascii="Times New Roman" w:eastAsia="Times New Roman" w:hAnsi="Times New Roman" w:cs="Times New Roman"/>
+          <w:b/>
+          <w:bCs/>
+          <w:color w:val="000000"/>
+          <w:kern w:val="0"/>
+          <w14:ligatures w14:val="none"/>
+        </w:rPr>
+        <w:t>8081</w:t>
+      </w:r>
+      <w:r>
+        <w:rPr>
+          <w:rFonts w:ascii="Times New Roman" w:eastAsia="Times New Roman" w:hAnsi="Times New Roman" w:cs="Times New Roman"/>
+          <w:color w:val="000000"/>
+          <w:kern w:val="0"/>
+          <w14:ligatures w14:val="none"/>
+        </w:rPr>
+        <w:t> (WebSocket) ve </w:t>
+      </w:r>
+      <w:r>
+        <w:rPr>
+          <w:rFonts w:ascii="Times New Roman" w:eastAsia="Times New Roman" w:hAnsi="Times New Roman" w:cs="Times New Roman"/>
+          <w:b/>
+          <w:bCs/>
+          <w:color w:val="000000"/>
+          <w:kern w:val="0"/>
+          <w14:ligatures w14:val="none"/>
+        </w:rPr>
+        <w:t>22</w:t>
+      </w:r>
+      <w:r>
+        <w:rPr>
+          <w:rFonts w:ascii="Times New Roman" w:eastAsia="Times New Roman" w:hAnsi="Times New Roman" w:cs="Times New Roman"/>
+          <w:color w:val="000000"/>
+          <w:kern w:val="0"/>
+          <w14:ligatures w14:val="none"/>
+        </w:rPr>
+        <w:t> (SSH) portları yetkilendirilmiştir.</w:t>
+      </w:r>
+    </w:p>
+    <w:p>
+      <w:pPr>
+        <w:spacing w:before="100" w:beforeAutospacing="1" w:after="100" w:afterAutospacing="1" w:line="240" w:lineRule="auto"/>
+        <w:rPr>
+          <w:rFonts w:ascii="Times New Roman" w:eastAsia="Times New Roman" w:hAnsi="Times New Roman" w:cs="Times New Roman"/>
+          <w:color w:val="000000"/>
+          <w:kern w:val="0"/>
+          <w14:ligatures w14:val="none"/>
+        </w:rPr>
+      </w:pPr>
+      <w:r>
+        <w:rPr>
+          <w:rFonts w:ascii="Times New Roman" w:eastAsia="Times New Roman" w:hAnsi="Times New Roman" w:cs="Times New Roman"/>
+          <w:noProof/>
+          <w:color w:val="000000"/>
+          <w:kern w:val="0"/>
+        </w:rPr>
+        <w:drawing>
+          <wp:inline distT="0" distB="0" distL="0" distR="0" wp14:anchorId="721CC823" wp14:editId="5111A292">
+            <wp:extent cx="5943600" cy="2298700"/>
+            <wp:effectExtent l="0" t="0" r="0" b="0"/>
+            <wp:docPr id="1148377080" name="Picture 6"/>
+            <wp:cNvGraphicFramePr>
+              <a:graphicFrameLocks xmlns:a="http://schemas.openxmlformats.org/drawingml/2006/main" noChangeAspect="1"/>
+            </wp:cNvGraphicFramePr>
+            <a:graphic xmlns:a="http://schemas.openxmlformats.org/drawingml/2006/main">
+              <a:graphicData uri="http://schemas.openxmlformats.org/drawingml/2006/picture">
+                <pic:pic xmlns:pic="http://schemas.openxmlformats.org/drawingml/2006/picture">
+                  <pic:nvPicPr>
+                    <pic:cNvPr id="1148377080" name="Picture 1148377080"/>
+                    <pic:cNvPicPr/>
+                  </pic:nvPicPr>
+                  <pic:blipFill>
+                    <a:blip r:embed="rId9" cstate="print">
+                      <a:extLst>
+                        <a:ext uri="{28A0092B-C50C-407E-A947-70E740481C1C}">
+                          <a14:useLocalDpi xmlns:a14="http://schemas.microsoft.com/office/drawing/2010/main" val="0"/>
+                        </a:ext>
+                      </a:extLst>
+                    </a:blip>
+                    <a:stretch>
+                      <a:fillRect/>
+                    </a:stretch>
+                  </pic:blipFill>
+                  <pic:spPr>
+                    <a:xfrm>
+                      <a:off x="0" y="0"/>
+                      <a:ext cx="5943600" cy="2298700"/>
+                    </a:xfrm>
+                    <a:prstGeom prst="rect">
+                      <a:avLst/>
+                    </a:prstGeom>
+                  </pic:spPr>
+                </pic:pic>
+              </a:graphicData>
+            </a:graphic>
+          </wp:inline>
+        </w:drawing>
+      </w:r>
+    </w:p>
+    <w:p>
+      <w:pPr>
+        <w:spacing w:before="100" w:beforeAutospacing="1" w:after="100" w:afterAutospacing="1" w:line="240" w:lineRule="auto"/>
+        <w:outlineLvl w:val="3"/>
+        <w:rPr>
+          <w:rFonts w:ascii="Times New Roman" w:eastAsia="Times New Roman" w:hAnsi="Times New Roman" w:cs="Times New Roman"/>
+          <w:b/>
+          <w:bCs/>
+          <w:color w:val="000000"/>
+          <w:kern w:val="0"/>
+          <w14:ligatures w14:val="none"/>
+        </w:rPr>
+      </w:pPr>
+      <w:r>
+        <w:rPr>
+          <w:rFonts w:ascii="Times New Roman" w:eastAsia="Times New Roman" w:hAnsi="Times New Roman" w:cs="Times New Roman"/>
+          <w:b/>
+          <w:bCs/>
+          <w:color w:val="000000"/>
+          <w:kern w:val="0"/>
+          <w14:ligatures w14:val="none"/>
+        </w:rPr>
+        <w:t>3.2. Backend ve Süreç Yönetimi (PM2)</w:t>
+      </w:r>
+    </w:p>
+    <w:p>
+      <w:pPr>
+        <w:spacing w:before="100" w:beforeAutospacing="1" w:after="100" w:afterAutospacing="1" w:line="240" w:lineRule="auto"/>
+        <w:rPr>
+          <w:rFonts w:ascii="Times New Roman" w:eastAsia="Times New Roman" w:hAnsi="Times New Roman" w:cs="Times New Roman"/>
+          <w:color w:val="000000"/>
+          <w:kern w:val="0"/>
+          <w14:ligatures w14:val="none"/>
+        </w:rPr>
+      </w:pPr>
+      <w:r>
+        <w:rPr>
+          <w:rFonts w:ascii="Times New Roman" w:eastAsia="Times New Roman" w:hAnsi="Times New Roman" w:cs="Times New Roman"/>
+          <w:color w:val="000000"/>
+          <w:kern w:val="0"/>
+          <w14:ligatures w14:val="none"/>
+        </w:rPr>
+        <w:t>Node.js tabanlı backend uygulaması, sunucu kapansa dahi çalışmaya devam etmesi için </w:t>
+      </w:r>
+      <w:r>
+        <w:rPr>
+          <w:rFonts w:ascii="Times New Roman" w:eastAsia="Times New Roman" w:hAnsi="Times New Roman" w:cs="Times New Roman"/>
+          <w:b/>
+          <w:bCs/>
+          <w:color w:val="000000"/>
+          <w:kern w:val="0"/>
+          <w14:ligatures w14:val="none"/>
+        </w:rPr>
+        <w:t>PM2</w:t>
+      </w:r>
+      <w:r>
+        <w:rPr>
+          <w:rFonts w:ascii="Times New Roman" w:eastAsia="Times New Roman" w:hAnsi="Times New Roman" w:cs="Times New Roman"/>
+          <w:color w:val="000000"/>
+          <w:kern w:val="0"/>
+          <w14:ligatures w14:val="none"/>
+        </w:rPr>
+        <w:t> process manager ile yönetilmektedir. Bu sayede simülasyon 7/24 veri üretmeye devam eder.</w:t>
+      </w:r>
+    </w:p>
+    <w:p>
+      <w:pPr>
+        <w:spacing w:before="100" w:beforeAutospacing="1" w:after="100" w:afterAutospacing="1" w:line="240" w:lineRule="auto"/>
+        <w:rPr>
+          <w:rFonts w:ascii="Times New Roman" w:eastAsia="Times New Roman" w:hAnsi="Times New Roman" w:cs="Times New Roman"/>
+          <w:color w:val="000000"/>
+          <w:kern w:val="0"/>
+          <w14:ligatures w14:val="none"/>
+        </w:rPr>
+      </w:pPr>
+      <w:r>
+        <w:rPr>
+          <w:rFonts w:ascii="Times New Roman" w:eastAsia="Times New Roman" w:hAnsi="Times New Roman" w:cs="Times New Roman"/>
+          <w:noProof/>
+          <w:color w:val="000000"/>
+          <w:kern w:val="0"/>
+        </w:rPr>
+        <w:drawing>
+          <wp:inline distT="0" distB="0" distL="0" distR="0" wp14:anchorId="384ACA23" wp14:editId="49F8B85B">
+            <wp:extent cx="5943600" cy="1233170"/>
+            <wp:effectExtent l="0" t="0" r="0" b="0"/>
+            <wp:docPr id="1357290719" name="Picture 7"/>
+            <wp:cNvGraphicFramePr>
+              <a:graphicFrameLocks xmlns:a="http://schemas.openxmlformats.org/drawingml/2006/main" noChangeAspect="1"/>
+            </wp:cNvGraphicFramePr>
+            <a:graphic xmlns:a="http://schemas.openxmlformats.org/drawingml/2006/main">
+              <a:graphicData uri="http://schemas.openxmlformats.org/drawingml/2006/picture">
+                <pic:pic xmlns:pic="http://schemas.openxmlformats.org/drawingml/2006/picture">
+                  <pic:nvPicPr>
+                    <pic:cNvPr id="1357290719" name="Picture 1357290719"/>
+                    <pic:cNvPicPr/>
+                  </pic:nvPicPr>
+                  <pic:blipFill>
+                    <a:blip r:embed="rId10">
+                      <a:extLst>
+                        <a:ext uri="{28A0092B-C50C-407E-A947-70E740481C1C}">
+                          <a14:useLocalDpi xmlns:a14="http://schemas.microsoft.com/office/drawing/2010/main" val="0"/>
+                        </a:ext>
+                      </a:extLst>
+                    </a:blip>
+                    <a:stretch>
+                      <a:fillRect/>
+                    </a:stretch>
+                  </pic:blipFill>
+                  <pic:spPr>
+                    <a:xfrm>
+                      <a:off x="0" y="0"/>
+                      <a:ext cx="5943600" cy="1233170"/>
+                    </a:xfrm>
+                    <a:prstGeom prst="rect">
+                      <a:avLst/>
+                    </a:prstGeom>
+                  </pic:spPr>
+                </pic:pic>
+              </a:graphicData>
+            </a:graphic>
+          </wp:inline>
+        </w:drawing>
+      </w:r>
+    </w:p>
+    <w:p>
+      <w:pPr>
+        <w:spacing w:before="100" w:beforeAutospacing="1" w:after="100" w:afterAutospacing="1" w:line="240" w:lineRule="auto"/>
+        <w:outlineLvl w:val="3"/>
+        <w:rPr>
+          <w:rFonts w:ascii="Times New Roman" w:eastAsia="Times New Roman" w:hAnsi="Times New Roman" w:cs="Times New Roman"/>
+          <w:b/>
+          <w:bCs/>
+          <w:color w:val="000000"/>
+          <w:kern w:val="0"/>
+          <w14:ligatures w14:val="none"/>
+        </w:rPr>
+      </w:pPr>
+    </w:p>
+    <w:p>
+      <w:pPr>
+        <w:spacing w:before="100" w:beforeAutospacing="1" w:after="100" w:afterAutospacing="1" w:line="240" w:lineRule="auto"/>
+        <w:outlineLvl w:val="3"/>
+        <w:rPr>
+          <w:rFonts w:ascii="Times New Roman" w:eastAsia="Times New Roman" w:hAnsi="Times New Roman" w:cs="Times New Roman"/>
+          <w:b/>
+          <w:bCs/>
+          <w:color w:val="000000"/>
+          <w:kern w:val="0"/>
+          <w14:ligatures w14:val="none"/>
+        </w:rPr>
+      </w:pPr>
+    </w:p>
+    <w:p>
+      <w:pPr>
+        <w:spacing w:before="100" w:beforeAutospacing="1" w:after="100" w:afterAutospacing="1" w:line="240" w:lineRule="auto"/>
+        <w:outlineLvl w:val="3"/>
+        <w:rPr>
+          <w:rFonts w:ascii="Times New Roman" w:eastAsia="Times New Roman" w:hAnsi="Times New Roman" w:cs="Times New Roman"/>
+          <w:b/>
+          <w:bCs/>
+          <w:color w:val="000000"/>
+          <w:kern w:val="0"/>
+          <w14:ligatures w14:val="none"/>
+        </w:rPr>
+      </w:pPr>
+    </w:p>
+    <w:p>
+      <w:pPr>
+        <w:spacing w:before="100" w:beforeAutospacing="1" w:after="100" w:afterAutospacing="1" w:line="240" w:lineRule="auto"/>
+        <w:outlineLvl w:val="3"/>
+        <w:rPr>
+          <w:rFonts w:ascii="Times New Roman" w:eastAsia="Times New Roman" w:hAnsi="Times New Roman" w:cs="Times New Roman"/>
+          <w:b/>
+          <w:bCs/>
+          <w:color w:val="000000"/>
+          <w:kern w:val="0"/>
+          <w14:ligatures w14:val="none"/>
+        </w:rPr>
+      </w:pPr>
+      <w:r>
+        <w:rPr>
+          <w:rFonts w:ascii="Times New Roman" w:eastAsia="Times New Roman" w:hAnsi="Times New Roman" w:cs="Times New Roman"/>
+          <w:b/>
+          <w:bCs/>
+          <w:color w:val="000000"/>
+          <w:kern w:val="0"/>
+          <w14:ligatures w14:val="none"/>
+        </w:rPr>
+        <w:lastRenderedPageBreak/>
+        <w:t>3.3. Gerçek Zamanlı Takip Arayüzü (Frontend)</w:t>
+      </w:r>
+    </w:p>
+    <w:p>
+      <w:pPr>
+        <w:spacing w:before="100" w:beforeAutospacing="1" w:after="100" w:afterAutospacing="1" w:line="240" w:lineRule="auto"/>
+        <w:rPr>
+          <w:rFonts w:ascii="Times New Roman" w:eastAsia="Times New Roman" w:hAnsi="Times New Roman" w:cs="Times New Roman"/>
+          <w:color w:val="000000"/>
+          <w:kern w:val="0"/>
+          <w14:ligatures w14:val="none"/>
+        </w:rPr>
+      </w:pPr>
+      <w:r>
+        <w:rPr>
+          <w:rFonts w:ascii="Times New Roman" w:eastAsia="Times New Roman" w:hAnsi="Times New Roman" w:cs="Times New Roman"/>
+          <w:color w:val="000000"/>
+          <w:kern w:val="0"/>
+          <w14:ligatures w14:val="none"/>
+        </w:rPr>
+        <w:t>Kullanıcılar, WebSocket üzerinden sunucuya bağlanarak aracın hız, devir ve konum verilerini anlık olarak takip edebilmektedir.</w:t>
+      </w:r>
+    </w:p>
+    <w:p>
+      <w:pPr>
+        <w:spacing w:before="100" w:beforeAutospacing="1" w:after="100" w:afterAutospacing="1" w:line="240" w:lineRule="auto"/>
+        <w:outlineLvl w:val="3"/>
+        <w:rPr>
+          <w:rFonts w:ascii="Times New Roman" w:eastAsia="Times New Roman" w:hAnsi="Times New Roman" w:cs="Times New Roman"/>
+          <w:b/>
+          <w:bCs/>
+          <w:color w:val="000000"/>
+          <w:kern w:val="0"/>
+          <w14:ligatures w14:val="none"/>
+        </w:rPr>
+      </w:pPr>
+      <w:r>
+        <w:rPr>
+          <w:rFonts w:ascii="Times New Roman" w:eastAsia="Times New Roman" w:hAnsi="Times New Roman" w:cs="Times New Roman"/>
+          <w:b/>
+          <w:bCs/>
+          <w:noProof/>
+          <w:color w:val="000000"/>
+          <w:kern w:val="0"/>
+        </w:rPr>
+        <w:drawing>
+          <wp:inline distT="0" distB="0" distL="0" distR="0" wp14:anchorId="69D0961C" wp14:editId="01205962">
+            <wp:extent cx="5943600" cy="2927350"/>
+            <wp:effectExtent l="0" t="0" r="0" b="6350"/>
+            <wp:docPr id="1187392863" name="Picture 8"/>
+            <wp:cNvGraphicFramePr>
+              <a:graphicFrameLocks xmlns:a="http://schemas.openxmlformats.org/drawingml/2006/main" noChangeAspect="1"/>
+            </wp:cNvGraphicFramePr>
+            <a:graphic xmlns:a="http://schemas.openxmlformats.org/drawingml/2006/main">
+              <a:graphicData uri="http://schemas.openxmlformats.org/drawingml/2006/picture">
+                <pic:pic xmlns:pic="http://schemas.openxmlformats.org/drawingml/2006/picture">
+                  <pic:nvPicPr>
+                    <pic:cNvPr id="1187392863" name="Picture 1187392863"/>
+                    <pic:cNvPicPr/>
+                  </pic:nvPicPr>
+                  <pic:blipFill>
+                    <a:blip r:embed="rId11" cstate="print">
+                      <a:extLst>
+                        <a:ext uri="{28A0092B-C50C-407E-A947-70E740481C1C}">
+                          <a14:useLocalDpi xmlns:a14="http://schemas.microsoft.com/office/drawing/2010/main" val="0"/>
+                        </a:ext>
+                      </a:extLst>
+                    </a:blip>
+                    <a:stretch>
+                      <a:fillRect/>
+                    </a:stretch>
+                  </pic:blipFill>
+                  <pic:spPr>
+                    <a:xfrm>
+                      <a:off x="0" y="0"/>
+                      <a:ext cx="5943600" cy="2927350"/>
+                    </a:xfrm>
+                    <a:prstGeom prst="rect">
+                      <a:avLst/>
+                    </a:prstGeom>
+                  </pic:spPr>
+                </pic:pic>
+              </a:graphicData>
+            </a:graphic>
+          </wp:inline>
+        </w:drawing>
+      </w:r>
+    </w:p>
+    <w:p>
+      <w:pPr>
+        <w:spacing w:before="100" w:beforeAutospacing="1" w:after="100" w:afterAutospacing="1" w:line="240" w:lineRule="auto"/>
+        <w:outlineLvl w:val="3"/>
+        <w:rPr>
+          <w:rFonts w:ascii="Times New Roman" w:eastAsia="Times New Roman" w:hAnsi="Times New Roman" w:cs="Times New Roman"/>
+          <w:b/>
+          <w:bCs/>
+          <w:color w:val="000000"/>
+          <w:kern w:val="0"/>
+          <w14:ligatures w14:val="none"/>
+        </w:rPr>
+      </w:pPr>
+      <w:r>
+        <w:rPr>
+          <w:rFonts w:ascii="Times New Roman" w:eastAsia="Times New Roman" w:hAnsi="Times New Roman" w:cs="Times New Roman"/>
+          <w:b/>
+          <w:bCs/>
+          <w:color w:val="000000"/>
+          <w:kern w:val="0"/>
+          <w14:ligatures w14:val="none"/>
+        </w:rPr>
+        <w:t>3.4. NoSQL Veri Depolama (DynamoDB)</w:t>
+      </w:r>
+    </w:p>
+    <w:p>
+      <w:pPr>
+        <w:spacing w:before="100" w:beforeAutospacing="1" w:after="100" w:afterAutospacing="1" w:line="240" w:lineRule="auto"/>
+        <w:rPr>
+          <w:rFonts w:ascii="Times New Roman" w:eastAsia="Times New Roman" w:hAnsi="Times New Roman" w:cs="Times New Roman"/>
+          <w:color w:val="000000"/>
+          <w:kern w:val="0"/>
+          <w14:ligatures w14:val="none"/>
+        </w:rPr>
+      </w:pPr>
+      <w:r>
+        <w:rPr>
+          <w:rFonts w:ascii="Times New Roman" w:eastAsia="Times New Roman" w:hAnsi="Times New Roman" w:cs="Times New Roman"/>
+          <w:color w:val="000000"/>
+          <w:kern w:val="0"/>
+          <w14:ligatures w14:val="none"/>
+        </w:rPr>
+        <w:t>Üretilen her telemetri verisi, eş zamanlı olarak AWS DynamoDB tablosuna yazılmaktadır. Veriler </w:t>
+      </w:r>
+      <w:r>
+        <w:rPr>
+          <w:rFonts w:ascii="Courier New" w:eastAsia="Times New Roman" w:hAnsi="Courier New" w:cs="Courier New"/>
+          <w:color w:val="000000"/>
+          <w:kern w:val="0"/>
+          <w:sz w:val="20"/>
+          <w:szCs w:val="20"/>
+          <w14:ligatures w14:val="none"/>
+        </w:rPr>
+        <w:t>arac_id</w:t>
+      </w:r>
+      <w:r>
+        <w:rPr>
+          <w:rFonts w:ascii="Times New Roman" w:eastAsia="Times New Roman" w:hAnsi="Times New Roman" w:cs="Times New Roman"/>
+          <w:color w:val="000000"/>
+          <w:kern w:val="0"/>
+          <w14:ligatures w14:val="none"/>
+        </w:rPr>
+        <w:t> ve </w:t>
+      </w:r>
+      <w:r>
+        <w:rPr>
+          <w:rFonts w:ascii="Courier New" w:eastAsia="Times New Roman" w:hAnsi="Courier New" w:cs="Courier New"/>
+          <w:color w:val="000000"/>
+          <w:kern w:val="0"/>
+          <w:sz w:val="20"/>
+          <w:szCs w:val="20"/>
+          <w14:ligatures w14:val="none"/>
+        </w:rPr>
+        <w:t>timestamp</w:t>
+      </w:r>
+      <w:r>
+        <w:rPr>
+          <w:rFonts w:ascii="Courier New" w:eastAsia="Times New Roman" w:hAnsi="Courier New" w:cs="Courier New"/>
+          <w:color w:val="000000"/>
+          <w:kern w:val="0"/>
+          <w:sz w:val="20"/>
+          <w:szCs w:val="20"/>
+          <w14:ligatures w14:val="none"/>
+        </w:rPr>
+        <w:t xml:space="preserve"> </w:t>
+      </w:r>
+      <w:r>
+        <w:rPr>
+          <w:rFonts w:ascii="Times New Roman" w:eastAsia="Times New Roman" w:hAnsi="Times New Roman" w:cs="Times New Roman"/>
+          <w:color w:val="000000"/>
+          <w:kern w:val="0"/>
+          <w14:ligatures w14:val="none"/>
+        </w:rPr>
+        <w:t>anahtarlarıyla sorgulanabilir haldedir.</w:t>
+      </w:r>
+    </w:p>
+    <w:p>
+      <w:r>
+        <w:rPr>
+          <w:noProof/>
+        </w:rPr>
+        <w:drawing>
+          <wp:inline distT="0" distB="0" distL="0" distR="0" wp14:anchorId="7C23A692" wp14:editId="68E3AAE7">
+            <wp:extent cx="5943600" cy="2927350"/>
+            <wp:effectExtent l="0" t="0" r="0" b="6350"/>
+            <wp:docPr id="402683362" name="Picture 9"/>
+            <wp:cNvGraphicFramePr>
+              <a:graphicFrameLocks xmlns:a="http://schemas.openxmlformats.org/drawingml/2006/main" noChangeAspect="1"/>
+            </wp:cNvGraphicFramePr>
+            <a:graphic xmlns:a="http://schemas.openxmlformats.org/drawingml/2006/main">
+              <a:graphicData uri="http://schemas.openxmlformats.org/drawingml/2006/picture">
+                <pic:pic xmlns:pic="http://schemas.openxmlformats.org/drawingml/2006/picture">
+                  <pic:nvPicPr>
+                    <pic:cNvPr id="402683362" name="Picture 402683362"/>
+                    <pic:cNvPicPr/>
+                  </pic:nvPicPr>
+                  <pic:blipFill>
+                    <a:blip r:embed="rId12" cstate="print">
+                      <a:extLst>
+                        <a:ext uri="{28A0092B-C50C-407E-A947-70E740481C1C}">
+                          <a14:useLocalDpi xmlns:a14="http://schemas.microsoft.com/office/drawing/2010/main" val="0"/>
+                        </a:ext>
+                      </a:extLst>
+                    </a:blip>
+                    <a:stretch>
+                      <a:fillRect/>
+                    </a:stretch>
+                  </pic:blipFill>
+                  <pic:spPr>
+                    <a:xfrm>
+                      <a:off x="0" y="0"/>
+                      <a:ext cx="5943600" cy="2927350"/>
+                    </a:xfrm>
+                    <a:prstGeom prst="rect">
+                      <a:avLst/>
+                    </a:prstGeom>
+                  </pic:spPr>
+                </pic:pic>
+              </a:graphicData>
+            </a:graphic>
+          </wp:inline>
+        </w:drawing>
+      </w:r>
+    </w:p>
+    <w:p/>
+    <w:p>
+      <w:pPr>
+        <w:spacing w:before="100" w:beforeAutospacing="1" w:after="100" w:afterAutospacing="1" w:line="240" w:lineRule="auto"/>
+        <w:outlineLvl w:val="2"/>
+        <w:rPr>
+          <w:rFonts w:ascii="Times New Roman" w:eastAsia="Times New Roman" w:hAnsi="Times New Roman" w:cs="Times New Roman"/>
+          <w:b/>
+          <w:bCs/>
+          <w:color w:val="000000"/>
+          <w:kern w:val="0"/>
+          <w:sz w:val="27"/>
+          <w:szCs w:val="27"/>
+          <w14:ligatures w14:val="none"/>
+        </w:rPr>
+      </w:pPr>
+      <w:r>
+        <w:rPr>
+          <w:rFonts w:ascii="Times New Roman" w:eastAsia="Times New Roman" w:hAnsi="Times New Roman" w:cs="Times New Roman"/>
+          <w:b/>
+          <w:bCs/>
+          <w:color w:val="000000"/>
+          <w:kern w:val="0"/>
+          <w:sz w:val="27"/>
+          <w:szCs w:val="27"/>
+          <w14:ligatures w14:val="none"/>
+        </w:rPr>
+        <w:lastRenderedPageBreak/>
+        <w:t>4. SONUÇ</w:t>
+      </w:r>
+    </w:p>
+    <w:p>
+      <w:pPr>
+        <w:spacing w:before="100" w:beforeAutospacing="1" w:after="100" w:afterAutospacing="1" w:line="240" w:lineRule="auto"/>
+        <w:rPr>
+          <w:rFonts w:ascii="Times New Roman" w:eastAsia="Times New Roman" w:hAnsi="Times New Roman" w:cs="Times New Roman"/>
+          <w:color w:val="000000"/>
+          <w:kern w:val="0"/>
+          <w14:ligatures w14:val="none"/>
+        </w:rPr>
+      </w:pPr>
+      <w:r>
+        <w:rPr>
+          <w:rFonts w:ascii="Times New Roman" w:eastAsia="Times New Roman" w:hAnsi="Times New Roman" w:cs="Times New Roman"/>
+          <w:color w:val="000000"/>
+          <w:kern w:val="0"/>
+          <w14:ligatures w14:val="none"/>
+        </w:rPr>
+        <w:t>Proje başarıyla tamamlanmıştır. Yerel ortamda başlayan geliştirme süreci, AWS bulut altyapısına taşınarak ölçeklenebilir ve kalıcı bir IoT çözümüne dönüştürülmüştür. WebSocket protokolünün hızı sayesinde veri gecikmesi minimuma indirilmiş, DynamoDB kullanımıyla ise verilerin güvenli depolanması sağlanmıştır.</w:t>
+      </w:r>
+    </w:p>
+    <w:p/>
+    <w:p>
+      <w:pPr>
+        <w:spacing w:before="100" w:beforeAutospacing="1" w:after="100" w:afterAutospacing="1" w:line="240" w:lineRule="auto"/>
+        <w:outlineLvl w:val="2"/>
+        <w:rPr>
+          <w:rFonts w:ascii="Times New Roman" w:eastAsia="Times New Roman" w:hAnsi="Times New Roman" w:cs="Times New Roman"/>
+          <w:b/>
+          <w:bCs/>
+          <w:color w:val="000000"/>
+          <w:kern w:val="0"/>
+          <w:sz w:val="27"/>
+          <w:szCs w:val="27"/>
+          <w14:ligatures w14:val="none"/>
+        </w:rPr>
+      </w:pPr>
+      <w:r>
+        <w:rPr>
+          <w:rFonts w:ascii="Times New Roman" w:eastAsia="Times New Roman" w:hAnsi="Times New Roman" w:cs="Times New Roman"/>
+          <w:b/>
+          <w:bCs/>
+          <w:color w:val="000000"/>
+          <w:kern w:val="0"/>
+          <w:sz w:val="27"/>
+          <w:szCs w:val="27"/>
+          <w14:ligatures w14:val="none"/>
+        </w:rPr>
+        <w:t>5. KAYNAKÇA VE ERİŞİM BİLGİLERİ</w:t>
+      </w:r>
+    </w:p>
+    <w:p>
+      <w:pPr>
+        <w:numPr>
+          <w:ilvl w:val="0"/>
+          <w:numId w:val="4"/>
+        </w:numPr>
+        <w:spacing w:before="100" w:beforeAutospacing="1" w:after="100" w:afterAutospacing="1" w:line="240" w:lineRule="auto"/>
+        <w:rPr>
+          <w:rFonts w:ascii="Times New Roman" w:eastAsia="Times New Roman" w:hAnsi="Times New Roman" w:cs="Times New Roman"/>
+          <w:color w:val="000000"/>
+          <w:kern w:val="0"/>
+          <w14:ligatures w14:val="none"/>
+        </w:rPr>
+      </w:pPr>
+      <w:r>
+        <w:rPr>
+          <w:rFonts w:ascii="Times New Roman" w:eastAsia="Times New Roman" w:hAnsi="Times New Roman" w:cs="Times New Roman"/>
+          <w:b/>
+          <w:bCs/>
+          <w:color w:val="000000"/>
+          <w:kern w:val="0"/>
+          <w14:ligatures w14:val="none"/>
+        </w:rPr>
+        <w:t>Canlı Sunucu IP:</w:t>
+      </w:r>
+      <w:r>
+        <w:rPr>
+          <w:rFonts w:ascii="Times New Roman" w:eastAsia="Times New Roman" w:hAnsi="Times New Roman" w:cs="Times New Roman"/>
+          <w:color w:val="000000"/>
+          <w:kern w:val="0"/>
+          <w14:ligatures w14:val="none"/>
+        </w:rPr>
+        <w:t> </w:t>
+      </w:r>
+      <w:r>
+        <w:rPr>
+          <w:rFonts w:ascii="Courier New" w:eastAsia="Times New Roman" w:hAnsi="Courier New" w:cs="Courier New"/>
+          <w:color w:val="000000"/>
+          <w:kern w:val="0"/>
+          <w:sz w:val="20"/>
+          <w:szCs w:val="20"/>
+          <w14:ligatures w14:val="none"/>
+        </w:rPr>
+        <w:t>13.62.54.131</w:t>
+      </w:r>
+    </w:p>
+    <w:p>
+      <w:pPr>
+        <w:numPr>
+          <w:ilvl w:val="0"/>
+          <w:numId w:val="4"/>
+        </w:numPr>
+        <w:spacing w:before="100" w:beforeAutospacing="1" w:after="100" w:afterAutospacing="1" w:line="240" w:lineRule="auto"/>
+        <w:rPr>
+          <w:rFonts w:ascii="Times New Roman" w:eastAsia="Times New Roman" w:hAnsi="Times New Roman" w:cs="Times New Roman"/>
+          <w:color w:val="000000"/>
+          <w:kern w:val="0"/>
+          <w14:ligatures w14:val="none"/>
+        </w:rPr>
+      </w:pPr>
+      <w:r>
+        <w:rPr>
+          <w:rFonts w:ascii="Times New Roman" w:eastAsia="Times New Roman" w:hAnsi="Times New Roman" w:cs="Times New Roman"/>
+          <w:b/>
+          <w:bCs/>
+          <w:color w:val="000000"/>
+          <w:kern w:val="0"/>
+          <w14:ligatures w14:val="none"/>
+        </w:rPr>
+        <w:t>Haberleşme Portu:</w:t>
+      </w:r>
+      <w:r>
+        <w:rPr>
+          <w:rFonts w:ascii="Times New Roman" w:eastAsia="Times New Roman" w:hAnsi="Times New Roman" w:cs="Times New Roman"/>
+          <w:color w:val="000000"/>
+          <w:kern w:val="0"/>
+          <w14:ligatures w14:val="none"/>
+        </w:rPr>
+        <w:t> </w:t>
+      </w:r>
+      <w:r>
+        <w:rPr>
+          <w:rFonts w:ascii="Courier New" w:eastAsia="Times New Roman" w:hAnsi="Courier New" w:cs="Courier New"/>
+          <w:color w:val="000000"/>
+          <w:kern w:val="0"/>
+          <w:sz w:val="20"/>
+          <w:szCs w:val="20"/>
+          <w14:ligatures w14:val="none"/>
+        </w:rPr>
+        <w:t>8081</w:t>
+      </w:r>
+    </w:p>
+    <w:p>
+      <w:pPr>
+        <w:numPr>
+          <w:ilvl w:val="0"/>
+          <w:numId w:val="4"/>
+        </w:numPr>
+        <w:spacing w:before="100" w:beforeAutospacing="1" w:after="100" w:afterAutospacing="1" w:line="240" w:lineRule="auto"/>
+        <w:rPr>
+          <w:rFonts w:ascii="Times New Roman" w:eastAsia="Times New Roman" w:hAnsi="Times New Roman" w:cs="Times New Roman"/>
+          <w:color w:val="000000"/>
+          <w:kern w:val="0"/>
+          <w14:ligatures w14:val="none"/>
+        </w:rPr>
+      </w:pPr>
+      <w:r>
+        <w:rPr>
+          <w:rFonts w:ascii="Times New Roman" w:eastAsia="Times New Roman" w:hAnsi="Times New Roman" w:cs="Times New Roman"/>
+          <w:b/>
+          <w:bCs/>
+          <w:color w:val="000000"/>
+          <w:kern w:val="0"/>
+          <w14:ligatures w14:val="none"/>
+        </w:rPr>
+        <w:t>Veritabanı Bölgesi:</w:t>
+      </w:r>
+      <w:r>
+        <w:rPr>
+          <w:rFonts w:ascii="Times New Roman" w:eastAsia="Times New Roman" w:hAnsi="Times New Roman" w:cs="Times New Roman"/>
+          <w:color w:val="000000"/>
+          <w:kern w:val="0"/>
+          <w14:ligatures w14:val="none"/>
+        </w:rPr>
+        <w:t> </w:t>
+      </w:r>
+      <w:r>
+        <w:rPr>
+          <w:rFonts w:ascii="Courier New" w:eastAsia="Times New Roman" w:hAnsi="Courier New" w:cs="Courier New"/>
+          <w:color w:val="000000"/>
+          <w:kern w:val="0"/>
+          <w:sz w:val="20"/>
+          <w:szCs w:val="20"/>
+          <w14:ligatures w14:val="none"/>
+        </w:rPr>
+        <w:t>us-east-2 (Ohio)</w:t>
+      </w:r>
+    </w:p>
+    <w:p/>
     <w:sectPr>
       <w:pgSz w:w="12240" w:h="15840"/>
       <w:pgMar w:top="1440" w:right="1440" w:bottom="1440" w:left="1440" w:header="708" w:footer="708" w:gutter="0"/>
@@ -436,6 +1853,633 @@
     </w:sectPr>
   </w:body>
 </w:document>
+</file>
+
+<file path=word/endnotes.xml><?xml version="1.0" encoding="utf-8"?>
+<w:endnotes xmlns:wpc="http://schemas.microsoft.com/office/word/2010/wordprocessingCanvas" xmlns:cx="http://schemas.microsoft.com/office/drawing/2014/chartex" xmlns:cx1="http://schemas.microsoft.com/office/drawing/2015/9/8/chartex" xmlns:cx2="http://schemas.microsoft.com/office/drawing/2015/10/21/chartex" xmlns:cx3="http://schemas.microsoft.com/office/drawing/2016/5/9/chartex" xmlns:cx4="http://schemas.microsoft.com/office/drawing/2016/5/10/chartex" xmlns:cx5="http://schemas.microsoft.com/office/drawing/2016/5/11/chartex" xmlns:cx6="http://schemas.microsoft.com/office/drawing/2016/5/12/chartex" xmlns:cx7="http://schemas.microsoft.com/office/drawing/2016/5/13/chartex" xmlns:cx8="http://schemas.microsoft.com/office/drawing/2016/5/14/chartex" xmlns:mc="http://schemas.openxmlformats.org/markup-compatibility/2006" xmlns:aink="http://schemas.microsoft.com/office/drawing/2016/ink" xmlns:am3d="http://schemas.microsoft.com/office/drawing/2017/model3d" xmlns:o="urn:schemas-microsoft-com:office:office" xmlns:oel="http://schemas.microsoft.com/office/2019/extlst" xmlns:r="http://schemas.openxmlformats.org/officeDocument/2006/relationships" xmlns:m="http://schemas.openxmlformats.org/officeDocument/2006/math" xmlns:v="urn:schemas-microsoft-com:vml" xmlns:wp14="http://schemas.microsoft.com/office/word/2010/wordprocessingDrawing" xmlns:wp="http://schemas.openxmlformats.org/drawingml/2006/wordprocessingDrawing" xmlns:w10="urn:schemas-microsoft-com:office:word" xmlns:w="http://schemas.openxmlformats.org/wordprocessingml/2006/main" xmlns:w14="http://schemas.microsoft.com/office/word/2010/wordml" xmlns:w15="http://schemas.microsoft.com/office/word/2012/wordml" xmlns:w16cex="http://schemas.microsoft.com/office/word/2018/wordml/cex" xmlns:w16cid="http://schemas.microsoft.com/office/word/2016/wordml/cid" xmlns:w16="http://schemas.microsoft.com/office/word/2018/wordml" xmlns:w16du="http://schemas.microsoft.com/office/word/2023/wordml/word16du" xmlns:w16sdtdh="http://schemas.microsoft.com/office/word/2020/wordml/sdtdatahash" xmlns:w16sdtfl="http://schemas.microsoft.com/office/word/2024/wordml/sdtformatlock" xmlns:w16se="http://schemas.microsoft.com/office/word/2015/wordml/symex" xmlns:wpg="http://schemas.microsoft.com/office/word/2010/wordprocessingGroup" xmlns:wpi="http://schemas.microsoft.com/office/word/2010/wordprocessingInk" xmlns:wne="http://schemas.microsoft.com/office/word/2006/wordml" xmlns:wps="http://schemas.microsoft.com/office/word/2010/wordprocessingShape" mc:Ignorable="w14 w15 w16se w16cid w16 w16cex w16sdtdh w16sdtfl w16du wp14">
+  <w:endnote w:type="separator" w:id="-1">
+    <w:p>
+      <w:pPr>
+        <w:spacing w:after="0" w:line="240" w:lineRule="auto"/>
+      </w:pPr>
+      <w:r>
+        <w:separator/>
+      </w:r>
+    </w:p>
+  </w:endnote>
+  <w:endnote w:type="continuationSeparator" w:id="0">
+    <w:p>
+      <w:pPr>
+        <w:spacing w:after="0" w:line="240" w:lineRule="auto"/>
+      </w:pPr>
+      <w:r>
+        <w:continuationSeparator/>
+      </w:r>
+    </w:p>
+  </w:endnote>
+</w:endnotes>
+</file>
+
+<file path=word/footnotes.xml><?xml version="1.0" encoding="utf-8"?>
+<w:footnotes xmlns:wpc="http://schemas.microsoft.com/office/word/2010/wordprocessingCanvas" xmlns:cx="http://schemas.microsoft.com/office/drawing/2014/chartex" xmlns:cx1="http://schemas.microsoft.com/office/drawing/2015/9/8/chartex" xmlns:cx2="http://schemas.microsoft.com/office/drawing/2015/10/21/chartex" xmlns:cx3="http://schemas.microsoft.com/office/drawing/2016/5/9/chartex" xmlns:cx4="http://schemas.microsoft.com/office/drawing/2016/5/10/chartex" xmlns:cx5="http://schemas.microsoft.com/office/drawing/2016/5/11/chartex" xmlns:cx6="http://schemas.microsoft.com/office/drawing/2016/5/12/chartex" xmlns:cx7="http://schemas.microsoft.com/office/drawing/2016/5/13/chartex" xmlns:cx8="http://schemas.microsoft.com/office/drawing/2016/5/14/chartex" xmlns:mc="http://schemas.openxmlformats.org/markup-compatibility/2006" xmlns:aink="http://schemas.microsoft.com/office/drawing/2016/ink" xmlns:am3d="http://schemas.microsoft.com/office/drawing/2017/model3d" xmlns:o="urn:schemas-microsoft-com:office:office" xmlns:oel="http://schemas.microsoft.com/office/2019/extlst" xmlns:r="http://schemas.openxmlformats.org/officeDocument/2006/relationships" xmlns:m="http://schemas.openxmlformats.org/officeDocument/2006/math" xmlns:v="urn:schemas-microsoft-com:vml" xmlns:wp14="http://schemas.microsoft.com/office/word/2010/wordprocessingDrawing" xmlns:wp="http://schemas.openxmlformats.org/drawingml/2006/wordprocessingDrawing" xmlns:w10="urn:schemas-microsoft-com:office:word" xmlns:w="http://schemas.openxmlformats.org/wordprocessingml/2006/main" xmlns:w14="http://schemas.microsoft.com/office/word/2010/wordml" xmlns:w15="http://schemas.microsoft.com/office/word/2012/wordml" xmlns:w16cex="http://schemas.microsoft.com/office/word/2018/wordml/cex" xmlns:w16cid="http://schemas.microsoft.com/office/word/2016/wordml/cid" xmlns:w16="http://schemas.microsoft.com/office/word/2018/wordml" xmlns:w16du="http://schemas.microsoft.com/office/word/2023/wordml/word16du" xmlns:w16sdtdh="http://schemas.microsoft.com/office/word/2020/wordml/sdtdatahash" xmlns:w16sdtfl="http://schemas.microsoft.com/office/word/2024/wordml/sdtformatlock" xmlns:w16se="http://schemas.microsoft.com/office/word/2015/wordml/symex" xmlns:wpg="http://schemas.microsoft.com/office/word/2010/wordprocessingGroup" xmlns:wpi="http://schemas.microsoft.com/office/word/2010/wordprocessingInk" xmlns:wne="http://schemas.microsoft.com/office/word/2006/wordml" xmlns:wps="http://schemas.microsoft.com/office/word/2010/wordprocessingShape" mc:Ignorable="w14 w15 w16se w16cid w16 w16cex w16sdtdh w16sdtfl w16du wp14">
+  <w:footnote w:type="separator" w:id="-1">
+    <w:p>
+      <w:pPr>
+        <w:spacing w:after="0" w:line="240" w:lineRule="auto"/>
+      </w:pPr>
+      <w:r>
+        <w:separator/>
+      </w:r>
+    </w:p>
+  </w:footnote>
+  <w:footnote w:type="continuationSeparator" w:id="0">
+    <w:p>
+      <w:pPr>
+        <w:spacing w:after="0" w:line="240" w:lineRule="auto"/>
+      </w:pPr>
+      <w:r>
+        <w:continuationSeparator/>
+      </w:r>
+    </w:p>
+  </w:footnote>
+</w:footnotes>
+</file>
+
+<file path=word/numbering.xml><?xml version="1.0" encoding="utf-8"?>
+<w:numbering xmlns:wpc="http://schemas.microsoft.com/office/word/2010/wordprocessingCanvas" xmlns:cx="http://schemas.microsoft.com/office/drawing/2014/chartex" xmlns:cx1="http://schemas.microsoft.com/office/drawing/2015/9/8/chartex" xmlns:cx2="http://schemas.microsoft.com/office/drawing/2015/10/21/chartex" xmlns:cx3="http://schemas.microsoft.com/office/drawing/2016/5/9/chartex" xmlns:cx4="http://schemas.microsoft.com/office/drawing/2016/5/10/chartex" xmlns:cx5="http://schemas.microsoft.com/office/drawing/2016/5/11/chartex" xmlns:cx6="http://schemas.microsoft.com/office/drawing/2016/5/12/chartex" xmlns:cx7="http://schemas.microsoft.com/office/drawing/2016/5/13/chartex" xmlns:cx8="http://schemas.microsoft.com/office/drawing/2016/5/14/chartex" xmlns:mc="http://schemas.openxmlformats.org/markup-compatibility/2006" xmlns:aink="http://schemas.microsoft.com/office/drawing/2016/ink" xmlns:am3d="http://schemas.microsoft.com/office/drawing/2017/model3d" xmlns:o="urn:schemas-microsoft-com:office:office" xmlns:oel="http://schemas.microsoft.com/office/2019/extlst" xmlns:r="http://schemas.openxmlformats.org/officeDocument/2006/relationships" xmlns:m="http://schemas.openxmlformats.org/officeDocument/2006/math" xmlns:v="urn:schemas-microsoft-com:vml" xmlns:wp14="http://schemas.microsoft.com/office/word/2010/wordprocessingDrawing" xmlns:wp="http://schemas.openxmlformats.org/drawingml/2006/wordprocessingDrawing" xmlns:w10="urn:schemas-microsoft-com:office:word" xmlns:w="http://schemas.openxmlformats.org/wordprocessingml/2006/main" xmlns:w14="http://schemas.microsoft.com/office/word/2010/wordml" xmlns:w15="http://schemas.microsoft.com/office/word/2012/wordml" xmlns:w16cex="http://schemas.microsoft.com/office/word/2018/wordml/cex" xmlns:w16cid="http://schemas.microsoft.com/office/word/2016/wordml/cid" xmlns:w16="http://schemas.microsoft.com/office/word/2018/wordml" xmlns:w16du="http://schemas.microsoft.com/office/word/2023/wordml/word16du" xmlns:w16sdtdh="http://schemas.microsoft.com/office/word/2020/wordml/sdtdatahash" xmlns:w16sdtfl="http://schemas.microsoft.com/office/word/2024/wordml/sdtformatlock" xmlns:w16se="http://schemas.microsoft.com/office/word/2015/wordml/symex" xmlns:wpg="http://schemas.microsoft.com/office/word/2010/wordprocessingGroup" xmlns:wpi="http://schemas.microsoft.com/office/word/2010/wordprocessingInk" xmlns:wne="http://schemas.microsoft.com/office/word/2006/wordml" xmlns:wps="http://schemas.microsoft.com/office/word/2010/wordprocessingShape" mc:Ignorable="w14 w15 w16se w16cid w16 w16cex w16sdtdh w16sdtfl w16du wp14">
+  <w:abstractNum w:abstractNumId="0" w15:restartNumberingAfterBreak="0">
+    <w:nsid w:val="1B2F0EFD"/>
+    <w:multiLevelType w:val="multilevel"/>
+    <w:tmpl w:val="5406ECA8"/>
+    <w:lvl w:ilvl="0">
+      <w:start w:val="1"/>
+      <w:numFmt w:val="bullet"/>
+      <w:lvlText w:val=""/>
+      <w:lvlJc w:val="left"/>
+      <w:pPr>
+        <w:tabs>
+          <w:tab w:val="num" w:pos="720"/>
+        </w:tabs>
+        <w:ind w:left="720" w:hanging="360"/>
+      </w:pPr>
+      <w:rPr>
+        <w:rFonts w:ascii="Symbol" w:hAnsi="Symbol" w:hint="default"/>
+        <w:sz w:val="20"/>
+      </w:rPr>
+    </w:lvl>
+    <w:lvl w:ilvl="1" w:tentative="1">
+      <w:start w:val="1"/>
+      <w:numFmt w:val="bullet"/>
+      <w:lvlText w:val="o"/>
+      <w:lvlJc w:val="left"/>
+      <w:pPr>
+        <w:tabs>
+          <w:tab w:val="num" w:pos="1440"/>
+        </w:tabs>
+        <w:ind w:left="1440" w:hanging="360"/>
+      </w:pPr>
+      <w:rPr>
+        <w:rFonts w:ascii="Courier New" w:hAnsi="Courier New" w:hint="default"/>
+        <w:sz w:val="20"/>
+      </w:rPr>
+    </w:lvl>
+    <w:lvl w:ilvl="2" w:tentative="1">
+      <w:start w:val="1"/>
+      <w:numFmt w:val="bullet"/>
+      <w:lvlText w:val=""/>
+      <w:lvlJc w:val="left"/>
+      <w:pPr>
+        <w:tabs>
+          <w:tab w:val="num" w:pos="2160"/>
+        </w:tabs>
+        <w:ind w:left="2160" w:hanging="360"/>
+      </w:pPr>
+      <w:rPr>
+        <w:rFonts w:ascii="Wingdings" w:hAnsi="Wingdings" w:hint="default"/>
+        <w:sz w:val="20"/>
+      </w:rPr>
+    </w:lvl>
+    <w:lvl w:ilvl="3" w:tentative="1">
+      <w:start w:val="1"/>
+      <w:numFmt w:val="bullet"/>
+      <w:lvlText w:val=""/>
+      <w:lvlJc w:val="left"/>
+      <w:pPr>
+        <w:tabs>
+          <w:tab w:val="num" w:pos="2880"/>
+        </w:tabs>
+        <w:ind w:left="2880" w:hanging="360"/>
+      </w:pPr>
+      <w:rPr>
+        <w:rFonts w:ascii="Wingdings" w:hAnsi="Wingdings" w:hint="default"/>
+        <w:sz w:val="20"/>
+      </w:rPr>
+    </w:lvl>
+    <w:lvl w:ilvl="4" w:tentative="1">
+      <w:start w:val="1"/>
+      <w:numFmt w:val="bullet"/>
+      <w:lvlText w:val=""/>
+      <w:lvlJc w:val="left"/>
+      <w:pPr>
+        <w:tabs>
+          <w:tab w:val="num" w:pos="3600"/>
+        </w:tabs>
+        <w:ind w:left="3600" w:hanging="360"/>
+      </w:pPr>
+      <w:rPr>
+        <w:rFonts w:ascii="Wingdings" w:hAnsi="Wingdings" w:hint="default"/>
+        <w:sz w:val="20"/>
+      </w:rPr>
+    </w:lvl>
+    <w:lvl w:ilvl="5" w:tentative="1">
+      <w:start w:val="1"/>
+      <w:numFmt w:val="bullet"/>
+      <w:lvlText w:val=""/>
+      <w:lvlJc w:val="left"/>
+      <w:pPr>
+        <w:tabs>
+          <w:tab w:val="num" w:pos="4320"/>
+        </w:tabs>
+        <w:ind w:left="4320" w:hanging="360"/>
+      </w:pPr>
+      <w:rPr>
+        <w:rFonts w:ascii="Wingdings" w:hAnsi="Wingdings" w:hint="default"/>
+        <w:sz w:val="20"/>
+      </w:rPr>
+    </w:lvl>
+    <w:lvl w:ilvl="6" w:tentative="1">
+      <w:start w:val="1"/>
+      <w:numFmt w:val="bullet"/>
+      <w:lvlText w:val=""/>
+      <w:lvlJc w:val="left"/>
+      <w:pPr>
+        <w:tabs>
+          <w:tab w:val="num" w:pos="5040"/>
+        </w:tabs>
+        <w:ind w:left="5040" w:hanging="360"/>
+      </w:pPr>
+      <w:rPr>
+        <w:rFonts w:ascii="Wingdings" w:hAnsi="Wingdings" w:hint="default"/>
+        <w:sz w:val="20"/>
+      </w:rPr>
+    </w:lvl>
+    <w:lvl w:ilvl="7" w:tentative="1">
+      <w:start w:val="1"/>
+      <w:numFmt w:val="bullet"/>
+      <w:lvlText w:val=""/>
+      <w:lvlJc w:val="left"/>
+      <w:pPr>
+        <w:tabs>
+          <w:tab w:val="num" w:pos="5760"/>
+        </w:tabs>
+        <w:ind w:left="5760" w:hanging="360"/>
+      </w:pPr>
+      <w:rPr>
+        <w:rFonts w:ascii="Wingdings" w:hAnsi="Wingdings" w:hint="default"/>
+        <w:sz w:val="20"/>
+      </w:rPr>
+    </w:lvl>
+    <w:lvl w:ilvl="8" w:tentative="1">
+      <w:start w:val="1"/>
+      <w:numFmt w:val="bullet"/>
+      <w:lvlText w:val=""/>
+      <w:lvlJc w:val="left"/>
+      <w:pPr>
+        <w:tabs>
+          <w:tab w:val="num" w:pos="6480"/>
+        </w:tabs>
+        <w:ind w:left="6480" w:hanging="360"/>
+      </w:pPr>
+      <w:rPr>
+        <w:rFonts w:ascii="Wingdings" w:hAnsi="Wingdings" w:hint="default"/>
+        <w:sz w:val="20"/>
+      </w:rPr>
+    </w:lvl>
+  </w:abstractNum>
+  <w:abstractNum w:abstractNumId="1" w15:restartNumberingAfterBreak="0">
+    <w:nsid w:val="2D234E64"/>
+    <w:multiLevelType w:val="multilevel"/>
+    <w:tmpl w:val="1A3E01A6"/>
+    <w:lvl w:ilvl="0">
+      <w:start w:val="1"/>
+      <w:numFmt w:val="bullet"/>
+      <w:lvlText w:val=""/>
+      <w:lvlJc w:val="left"/>
+      <w:pPr>
+        <w:tabs>
+          <w:tab w:val="num" w:pos="720"/>
+        </w:tabs>
+        <w:ind w:left="720" w:hanging="360"/>
+      </w:pPr>
+      <w:rPr>
+        <w:rFonts w:ascii="Symbol" w:hAnsi="Symbol" w:hint="default"/>
+        <w:sz w:val="20"/>
+      </w:rPr>
+    </w:lvl>
+    <w:lvl w:ilvl="1" w:tentative="1">
+      <w:start w:val="1"/>
+      <w:numFmt w:val="bullet"/>
+      <w:lvlText w:val="o"/>
+      <w:lvlJc w:val="left"/>
+      <w:pPr>
+        <w:tabs>
+          <w:tab w:val="num" w:pos="1440"/>
+        </w:tabs>
+        <w:ind w:left="1440" w:hanging="360"/>
+      </w:pPr>
+      <w:rPr>
+        <w:rFonts w:ascii="Courier New" w:hAnsi="Courier New" w:hint="default"/>
+        <w:sz w:val="20"/>
+      </w:rPr>
+    </w:lvl>
+    <w:lvl w:ilvl="2" w:tentative="1">
+      <w:start w:val="1"/>
+      <w:numFmt w:val="bullet"/>
+      <w:lvlText w:val=""/>
+      <w:lvlJc w:val="left"/>
+      <w:pPr>
+        <w:tabs>
+          <w:tab w:val="num" w:pos="2160"/>
+        </w:tabs>
+        <w:ind w:left="2160" w:hanging="360"/>
+      </w:pPr>
+      <w:rPr>
+        <w:rFonts w:ascii="Wingdings" w:hAnsi="Wingdings" w:hint="default"/>
+        <w:sz w:val="20"/>
+      </w:rPr>
+    </w:lvl>
+    <w:lvl w:ilvl="3" w:tentative="1">
+      <w:start w:val="1"/>
+      <w:numFmt w:val="bullet"/>
+      <w:lvlText w:val=""/>
+      <w:lvlJc w:val="left"/>
+      <w:pPr>
+        <w:tabs>
+          <w:tab w:val="num" w:pos="2880"/>
+        </w:tabs>
+        <w:ind w:left="2880" w:hanging="360"/>
+      </w:pPr>
+      <w:rPr>
+        <w:rFonts w:ascii="Wingdings" w:hAnsi="Wingdings" w:hint="default"/>
+        <w:sz w:val="20"/>
+      </w:rPr>
+    </w:lvl>
+    <w:lvl w:ilvl="4" w:tentative="1">
+      <w:start w:val="1"/>
+      <w:numFmt w:val="bullet"/>
+      <w:lvlText w:val=""/>
+      <w:lvlJc w:val="left"/>
+      <w:pPr>
+        <w:tabs>
+          <w:tab w:val="num" w:pos="3600"/>
+        </w:tabs>
+        <w:ind w:left="3600" w:hanging="360"/>
+      </w:pPr>
+      <w:rPr>
+        <w:rFonts w:ascii="Wingdings" w:hAnsi="Wingdings" w:hint="default"/>
+        <w:sz w:val="20"/>
+      </w:rPr>
+    </w:lvl>
+    <w:lvl w:ilvl="5" w:tentative="1">
+      <w:start w:val="1"/>
+      <w:numFmt w:val="bullet"/>
+      <w:lvlText w:val=""/>
+      <w:lvlJc w:val="left"/>
+      <w:pPr>
+        <w:tabs>
+          <w:tab w:val="num" w:pos="4320"/>
+        </w:tabs>
+        <w:ind w:left="4320" w:hanging="360"/>
+      </w:pPr>
+      <w:rPr>
+        <w:rFonts w:ascii="Wingdings" w:hAnsi="Wingdings" w:hint="default"/>
+        <w:sz w:val="20"/>
+      </w:rPr>
+    </w:lvl>
+    <w:lvl w:ilvl="6" w:tentative="1">
+      <w:start w:val="1"/>
+      <w:numFmt w:val="bullet"/>
+      <w:lvlText w:val=""/>
+      <w:lvlJc w:val="left"/>
+      <w:pPr>
+        <w:tabs>
+          <w:tab w:val="num" w:pos="5040"/>
+        </w:tabs>
+        <w:ind w:left="5040" w:hanging="360"/>
+      </w:pPr>
+      <w:rPr>
+        <w:rFonts w:ascii="Wingdings" w:hAnsi="Wingdings" w:hint="default"/>
+        <w:sz w:val="20"/>
+      </w:rPr>
+    </w:lvl>
+    <w:lvl w:ilvl="7" w:tentative="1">
+      <w:start w:val="1"/>
+      <w:numFmt w:val="bullet"/>
+      <w:lvlText w:val=""/>
+      <w:lvlJc w:val="left"/>
+      <w:pPr>
+        <w:tabs>
+          <w:tab w:val="num" w:pos="5760"/>
+        </w:tabs>
+        <w:ind w:left="5760" w:hanging="360"/>
+      </w:pPr>
+      <w:rPr>
+        <w:rFonts w:ascii="Wingdings" w:hAnsi="Wingdings" w:hint="default"/>
+        <w:sz w:val="20"/>
+      </w:rPr>
+    </w:lvl>
+    <w:lvl w:ilvl="8" w:tentative="1">
+      <w:start w:val="1"/>
+      <w:numFmt w:val="bullet"/>
+      <w:lvlText w:val=""/>
+      <w:lvlJc w:val="left"/>
+      <w:pPr>
+        <w:tabs>
+          <w:tab w:val="num" w:pos="6480"/>
+        </w:tabs>
+        <w:ind w:left="6480" w:hanging="360"/>
+      </w:pPr>
+      <w:rPr>
+        <w:rFonts w:ascii="Wingdings" w:hAnsi="Wingdings" w:hint="default"/>
+        <w:sz w:val="20"/>
+      </w:rPr>
+    </w:lvl>
+  </w:abstractNum>
+  <w:abstractNum w:abstractNumId="2" w15:restartNumberingAfterBreak="0">
+    <w:nsid w:val="32EA7576"/>
+    <w:multiLevelType w:val="multilevel"/>
+    <w:tmpl w:val="1FA41ED2"/>
+    <w:lvl w:ilvl="0">
+      <w:start w:val="1"/>
+      <w:numFmt w:val="decimal"/>
+      <w:lvlText w:val="%1."/>
+      <w:lvlJc w:val="left"/>
+      <w:pPr>
+        <w:tabs>
+          <w:tab w:val="num" w:pos="720"/>
+        </w:tabs>
+        <w:ind w:left="720" w:hanging="360"/>
+      </w:pPr>
+    </w:lvl>
+    <w:lvl w:ilvl="1" w:tentative="1">
+      <w:start w:val="1"/>
+      <w:numFmt w:val="decimal"/>
+      <w:lvlText w:val="%2."/>
+      <w:lvlJc w:val="left"/>
+      <w:pPr>
+        <w:tabs>
+          <w:tab w:val="num" w:pos="1440"/>
+        </w:tabs>
+        <w:ind w:left="1440" w:hanging="360"/>
+      </w:pPr>
+    </w:lvl>
+    <w:lvl w:ilvl="2" w:tentative="1">
+      <w:start w:val="1"/>
+      <w:numFmt w:val="decimal"/>
+      <w:lvlText w:val="%3."/>
+      <w:lvlJc w:val="left"/>
+      <w:pPr>
+        <w:tabs>
+          <w:tab w:val="num" w:pos="2160"/>
+        </w:tabs>
+        <w:ind w:left="2160" w:hanging="360"/>
+      </w:pPr>
+    </w:lvl>
+    <w:lvl w:ilvl="3" w:tentative="1">
+      <w:start w:val="1"/>
+      <w:numFmt w:val="decimal"/>
+      <w:lvlText w:val="%4."/>
+      <w:lvlJc w:val="left"/>
+      <w:pPr>
+        <w:tabs>
+          <w:tab w:val="num" w:pos="2880"/>
+        </w:tabs>
+        <w:ind w:left="2880" w:hanging="360"/>
+      </w:pPr>
+    </w:lvl>
+    <w:lvl w:ilvl="4" w:tentative="1">
+      <w:start w:val="1"/>
+      <w:numFmt w:val="decimal"/>
+      <w:lvlText w:val="%5."/>
+      <w:lvlJc w:val="left"/>
+      <w:pPr>
+        <w:tabs>
+          <w:tab w:val="num" w:pos="3600"/>
+        </w:tabs>
+        <w:ind w:left="3600" w:hanging="360"/>
+      </w:pPr>
+    </w:lvl>
+    <w:lvl w:ilvl="5" w:tentative="1">
+      <w:start w:val="1"/>
+      <w:numFmt w:val="decimal"/>
+      <w:lvlText w:val="%6."/>
+      <w:lvlJc w:val="left"/>
+      <w:pPr>
+        <w:tabs>
+          <w:tab w:val="num" w:pos="4320"/>
+        </w:tabs>
+        <w:ind w:left="4320" w:hanging="360"/>
+      </w:pPr>
+    </w:lvl>
+    <w:lvl w:ilvl="6" w:tentative="1">
+      <w:start w:val="1"/>
+      <w:numFmt w:val="decimal"/>
+      <w:lvlText w:val="%7."/>
+      <w:lvlJc w:val="left"/>
+      <w:pPr>
+        <w:tabs>
+          <w:tab w:val="num" w:pos="5040"/>
+        </w:tabs>
+        <w:ind w:left="5040" w:hanging="360"/>
+      </w:pPr>
+    </w:lvl>
+    <w:lvl w:ilvl="7" w:tentative="1">
+      <w:start w:val="1"/>
+      <w:numFmt w:val="decimal"/>
+      <w:lvlText w:val="%8."/>
+      <w:lvlJc w:val="left"/>
+      <w:pPr>
+        <w:tabs>
+          <w:tab w:val="num" w:pos="5760"/>
+        </w:tabs>
+        <w:ind w:left="5760" w:hanging="360"/>
+      </w:pPr>
+    </w:lvl>
+    <w:lvl w:ilvl="8" w:tentative="1">
+      <w:start w:val="1"/>
+      <w:numFmt w:val="decimal"/>
+      <w:lvlText w:val="%9."/>
+      <w:lvlJc w:val="left"/>
+      <w:pPr>
+        <w:tabs>
+          <w:tab w:val="num" w:pos="6480"/>
+        </w:tabs>
+        <w:ind w:left="6480" w:hanging="360"/>
+      </w:pPr>
+    </w:lvl>
+  </w:abstractNum>
+  <w:abstractNum w:abstractNumId="3" w15:restartNumberingAfterBreak="0">
+    <w:nsid w:val="78D5450F"/>
+    <w:multiLevelType w:val="multilevel"/>
+    <w:tmpl w:val="1F8206AA"/>
+    <w:lvl w:ilvl="0">
+      <w:start w:val="1"/>
+      <w:numFmt w:val="bullet"/>
+      <w:lvlText w:val=""/>
+      <w:lvlJc w:val="left"/>
+      <w:pPr>
+        <w:tabs>
+          <w:tab w:val="num" w:pos="720"/>
+        </w:tabs>
+        <w:ind w:left="720" w:hanging="360"/>
+      </w:pPr>
+      <w:rPr>
+        <w:rFonts w:ascii="Symbol" w:hAnsi="Symbol" w:hint="default"/>
+        <w:sz w:val="20"/>
+      </w:rPr>
+    </w:lvl>
+    <w:lvl w:ilvl="1" w:tentative="1">
+      <w:start w:val="1"/>
+      <w:numFmt w:val="bullet"/>
+      <w:lvlText w:val="o"/>
+      <w:lvlJc w:val="left"/>
+      <w:pPr>
+        <w:tabs>
+          <w:tab w:val="num" w:pos="1440"/>
+        </w:tabs>
+        <w:ind w:left="1440" w:hanging="360"/>
+      </w:pPr>
+      <w:rPr>
+        <w:rFonts w:ascii="Courier New" w:hAnsi="Courier New" w:hint="default"/>
+        <w:sz w:val="20"/>
+      </w:rPr>
+    </w:lvl>
+    <w:lvl w:ilvl="2" w:tentative="1">
+      <w:start w:val="1"/>
+      <w:numFmt w:val="bullet"/>
+      <w:lvlText w:val=""/>
+      <w:lvlJc w:val="left"/>
+      <w:pPr>
+        <w:tabs>
+          <w:tab w:val="num" w:pos="2160"/>
+        </w:tabs>
+        <w:ind w:left="2160" w:hanging="360"/>
+      </w:pPr>
+      <w:rPr>
+        <w:rFonts w:ascii="Wingdings" w:hAnsi="Wingdings" w:hint="default"/>
+        <w:sz w:val="20"/>
+      </w:rPr>
+    </w:lvl>
+    <w:lvl w:ilvl="3" w:tentative="1">
+      <w:start w:val="1"/>
+      <w:numFmt w:val="bullet"/>
+      <w:lvlText w:val=""/>
+      <w:lvlJc w:val="left"/>
+      <w:pPr>
+        <w:tabs>
+          <w:tab w:val="num" w:pos="2880"/>
+        </w:tabs>
+        <w:ind w:left="2880" w:hanging="360"/>
+      </w:pPr>
+      <w:rPr>
+        <w:rFonts w:ascii="Wingdings" w:hAnsi="Wingdings" w:hint="default"/>
+        <w:sz w:val="20"/>
+      </w:rPr>
+    </w:lvl>
+    <w:lvl w:ilvl="4" w:tentative="1">
+      <w:start w:val="1"/>
+      <w:numFmt w:val="bullet"/>
+      <w:lvlText w:val=""/>
+      <w:lvlJc w:val="left"/>
+      <w:pPr>
+        <w:tabs>
+          <w:tab w:val="num" w:pos="3600"/>
+        </w:tabs>
+        <w:ind w:left="3600" w:hanging="360"/>
+      </w:pPr>
+      <w:rPr>
+        <w:rFonts w:ascii="Wingdings" w:hAnsi="Wingdings" w:hint="default"/>
+        <w:sz w:val="20"/>
+      </w:rPr>
+    </w:lvl>
+    <w:lvl w:ilvl="5" w:tentative="1">
+      <w:start w:val="1"/>
+      <w:numFmt w:val="bullet"/>
+      <w:lvlText w:val=""/>
+      <w:lvlJc w:val="left"/>
+      <w:pPr>
+        <w:tabs>
+          <w:tab w:val="num" w:pos="4320"/>
+        </w:tabs>
+        <w:ind w:left="4320" w:hanging="360"/>
+      </w:pPr>
+      <w:rPr>
+        <w:rFonts w:ascii="Wingdings" w:hAnsi="Wingdings" w:hint="default"/>
+        <w:sz w:val="20"/>
+      </w:rPr>
+    </w:lvl>
+    <w:lvl w:ilvl="6" w:tentative="1">
+      <w:start w:val="1"/>
+      <w:numFmt w:val="bullet"/>
+      <w:lvlText w:val=""/>
+      <w:lvlJc w:val="left"/>
+      <w:pPr>
+        <w:tabs>
+          <w:tab w:val="num" w:pos="5040"/>
+        </w:tabs>
+        <w:ind w:left="5040" w:hanging="360"/>
+      </w:pPr>
+      <w:rPr>
+        <w:rFonts w:ascii="Wingdings" w:hAnsi="Wingdings" w:hint="default"/>
+        <w:sz w:val="20"/>
+      </w:rPr>
+    </w:lvl>
+    <w:lvl w:ilvl="7" w:tentative="1">
+      <w:start w:val="1"/>
+      <w:numFmt w:val="bullet"/>
+      <w:lvlText w:val=""/>
+      <w:lvlJc w:val="left"/>
+      <w:pPr>
+        <w:tabs>
+          <w:tab w:val="num" w:pos="5760"/>
+        </w:tabs>
+        <w:ind w:left="5760" w:hanging="360"/>
+      </w:pPr>
+      <w:rPr>
+        <w:rFonts w:ascii="Wingdings" w:hAnsi="Wingdings" w:hint="default"/>
+        <w:sz w:val="20"/>
+      </w:rPr>
+    </w:lvl>
+    <w:lvl w:ilvl="8" w:tentative="1">
+      <w:start w:val="1"/>
+      <w:numFmt w:val="bullet"/>
+      <w:lvlText w:val=""/>
+      <w:lvlJc w:val="left"/>
+      <w:pPr>
+        <w:tabs>
+          <w:tab w:val="num" w:pos="6480"/>
+        </w:tabs>
+        <w:ind w:left="6480" w:hanging="360"/>
+      </w:pPr>
+      <w:rPr>
+        <w:rFonts w:ascii="Wingdings" w:hAnsi="Wingdings" w:hint="default"/>
+        <w:sz w:val="20"/>
+      </w:rPr>
+    </w:lvl>
+  </w:abstractNum>
+  <w:num w:numId="1" w16cid:durableId="1313173962">
+    <w:abstractNumId w:val="0"/>
+  </w:num>
+  <w:num w:numId="2" w16cid:durableId="1887184940">
+    <w:abstractNumId w:val="2"/>
+  </w:num>
+  <w:num w:numId="3" w16cid:durableId="1426225782">
+    <w:abstractNumId w:val="1"/>
+  </w:num>
+  <w:num w:numId="4" w16cid:durableId="349332892">
+    <w:abstractNumId w:val="3"/>
+  </w:num>
+</w:numbering>
 </file>
 
 <file path=word/styles.xml><?xml version="1.0" encoding="utf-8"?>
@@ -890,7 +2934,6 @@
     <w:next w:val="Normal"/>
     <w:link w:val="Heading3Char"/>
     <w:uiPriority w:val="9"/>
-    <w:semiHidden/>
     <w:unhideWhenUsed/>
     <w:qFormat/>
     <w:rsid w:val="002B4CD6"/>
@@ -913,7 +2956,6 @@
     <w:next w:val="Normal"/>
     <w:link w:val="Heading4Char"/>
     <w:uiPriority w:val="9"/>
-    <w:semiHidden/>
     <w:unhideWhenUsed/>
     <w:qFormat/>
     <w:rsid w:val="002B4CD6"/>
@@ -1097,7 +3139,6 @@
     <w:basedOn w:val="DefaultParagraphFont"/>
     <w:link w:val="Heading3"/>
     <w:uiPriority w:val="9"/>
-    <w:semiHidden/>
     <w:rsid w:val="002B4CD6"/>
     <w:rPr>
       <w:rFonts w:eastAsiaTheme="majorEastAsia" w:cstheme="majorBidi"/>
@@ -1111,7 +3152,6 @@
     <w:basedOn w:val="DefaultParagraphFont"/>
     <w:link w:val="Heading4"/>
     <w:uiPriority w:val="9"/>
-    <w:semiHidden/>
     <w:rsid w:val="002B4CD6"/>
     <w:rPr>
       <w:rFonts w:eastAsiaTheme="majorEastAsia" w:cstheme="majorBidi"/>
@@ -1385,6 +3425,135 @@
       <w:color w:val="0000FF"/>
       <w:u w:val="single"/>
     </w:rPr>
+  </w:style>
+  <w:style w:type="character" w:styleId="HTMLCode">
+    <w:name w:val="HTML Code"/>
+    <w:basedOn w:val="DefaultParagraphFont"/>
+    <w:uiPriority w:val="99"/>
+    <w:semiHidden/>
+    <w:unhideWhenUsed/>
+    <w:rsid w:val="003B594D"/>
+    <w:rPr>
+      <w:rFonts w:ascii="Courier New" w:eastAsia="Times New Roman" w:hAnsi="Courier New" w:cs="Courier New"/>
+      <w:sz w:val="20"/>
+      <w:szCs w:val="20"/>
+    </w:rPr>
+  </w:style>
+  <w:style w:type="character" w:customStyle="1" w:styleId="ng-tns-c515271043-252">
+    <w:name w:val="ng-tns-c515271043-252"/>
+    <w:basedOn w:val="DefaultParagraphFont"/>
+    <w:rsid w:val="003B594D"/>
+  </w:style>
+  <w:style w:type="paragraph" w:styleId="HTMLPreformatted">
+    <w:name w:val="HTML Preformatted"/>
+    <w:basedOn w:val="Normal"/>
+    <w:link w:val="HTMLPreformattedChar"/>
+    <w:uiPriority w:val="99"/>
+    <w:semiHidden/>
+    <w:unhideWhenUsed/>
+    <w:rsid w:val="003B594D"/>
+    <w:pPr>
+      <w:tabs>
+        <w:tab w:val="left" w:pos="916"/>
+        <w:tab w:val="left" w:pos="1832"/>
+        <w:tab w:val="left" w:pos="2748"/>
+        <w:tab w:val="left" w:pos="3664"/>
+        <w:tab w:val="left" w:pos="4580"/>
+        <w:tab w:val="left" w:pos="5496"/>
+        <w:tab w:val="left" w:pos="6412"/>
+        <w:tab w:val="left" w:pos="7328"/>
+        <w:tab w:val="left" w:pos="8244"/>
+        <w:tab w:val="left" w:pos="9160"/>
+        <w:tab w:val="left" w:pos="10076"/>
+        <w:tab w:val="left" w:pos="10992"/>
+        <w:tab w:val="left" w:pos="11908"/>
+        <w:tab w:val="left" w:pos="12824"/>
+        <w:tab w:val="left" w:pos="13740"/>
+        <w:tab w:val="left" w:pos="14656"/>
+      </w:tabs>
+      <w:spacing w:after="0" w:line="240" w:lineRule="auto"/>
+    </w:pPr>
+    <w:rPr>
+      <w:rFonts w:ascii="Courier New" w:eastAsia="Times New Roman" w:hAnsi="Courier New" w:cs="Courier New"/>
+      <w:kern w:val="0"/>
+      <w:sz w:val="20"/>
+      <w:szCs w:val="20"/>
+      <w14:ligatures w14:val="none"/>
+    </w:rPr>
+  </w:style>
+  <w:style w:type="character" w:customStyle="1" w:styleId="HTMLPreformattedChar">
+    <w:name w:val="HTML Preformatted Char"/>
+    <w:basedOn w:val="DefaultParagraphFont"/>
+    <w:link w:val="HTMLPreformatted"/>
+    <w:uiPriority w:val="99"/>
+    <w:semiHidden/>
+    <w:rsid w:val="003B594D"/>
+    <w:rPr>
+      <w:rFonts w:ascii="Courier New" w:eastAsia="Times New Roman" w:hAnsi="Courier New" w:cs="Courier New"/>
+      <w:kern w:val="0"/>
+      <w:sz w:val="20"/>
+      <w:szCs w:val="20"/>
+      <w14:ligatures w14:val="none"/>
+    </w:rPr>
+  </w:style>
+  <w:style w:type="character" w:customStyle="1" w:styleId="hljs-attr">
+    <w:name w:val="hljs-attr"/>
+    <w:basedOn w:val="DefaultParagraphFont"/>
+    <w:rsid w:val="003B594D"/>
+  </w:style>
+  <w:style w:type="character" w:customStyle="1" w:styleId="hljs-string">
+    <w:name w:val="hljs-string"/>
+    <w:basedOn w:val="DefaultParagraphFont"/>
+    <w:rsid w:val="003B594D"/>
+  </w:style>
+  <w:style w:type="character" w:customStyle="1" w:styleId="hljs-number">
+    <w:name w:val="hljs-number"/>
+    <w:basedOn w:val="DefaultParagraphFont"/>
+    <w:rsid w:val="003B594D"/>
+  </w:style>
+  <w:style w:type="paragraph" w:styleId="Header">
+    <w:name w:val="header"/>
+    <w:basedOn w:val="Normal"/>
+    <w:link w:val="HeaderChar"/>
+    <w:uiPriority w:val="99"/>
+    <w:unhideWhenUsed/>
+    <w:rsid w:val="00934D50"/>
+    <w:pPr>
+      <w:tabs>
+        <w:tab w:val="center" w:pos="4680"/>
+        <w:tab w:val="right" w:pos="9360"/>
+      </w:tabs>
+      <w:spacing w:after="0" w:line="240" w:lineRule="auto"/>
+    </w:pPr>
+  </w:style>
+  <w:style w:type="character" w:customStyle="1" w:styleId="HeaderChar">
+    <w:name w:val="Header Char"/>
+    <w:basedOn w:val="DefaultParagraphFont"/>
+    <w:link w:val="Header"/>
+    <w:uiPriority w:val="99"/>
+    <w:rsid w:val="00934D50"/>
+  </w:style>
+  <w:style w:type="paragraph" w:styleId="Footer">
+    <w:name w:val="footer"/>
+    <w:basedOn w:val="Normal"/>
+    <w:link w:val="FooterChar"/>
+    <w:uiPriority w:val="99"/>
+    <w:unhideWhenUsed/>
+    <w:rsid w:val="00934D50"/>
+    <w:pPr>
+      <w:tabs>
+        <w:tab w:val="center" w:pos="4680"/>
+        <w:tab w:val="right" w:pos="9360"/>
+      </w:tabs>
+      <w:spacing w:after="0" w:line="240" w:lineRule="auto"/>
+    </w:pPr>
+  </w:style>
+  <w:style w:type="character" w:customStyle="1" w:styleId="FooterChar">
+    <w:name w:val="Footer Char"/>
+    <w:basedOn w:val="DefaultParagraphFont"/>
+    <w:link w:val="Footer"/>
+    <w:uiPriority w:val="99"/>
+    <w:rsid w:val="00934D50"/>
   </w:style>
 </w:styles>
 </file>

</xml_diff>